<commit_message>
Documentação: DOC-13 1.1 (busca de órgãos) e DOC-11 regerado
</commit_message>
<xml_diff>
--- a/docs/DOC-13_Paineis.docx
+++ b/docs/DOC-13_Paineis.docx
@@ -267,7 +267,7 @@
                 <w:sz w:val="19"/>
                 <w:szCs w:val="19"/>
               </w:rPr>
-              <w:t xml:space="preserve">1.0</w:t>
+              <w:t xml:space="preserve">1.1</w:t>
             </w:r>
           </w:p>
         </w:tc>
@@ -326,7 +326,7 @@
                 <w:sz w:val="19"/>
                 <w:szCs w:val="19"/>
               </w:rPr>
-              <w:t xml:space="preserve">14 de outubro de 2026</w:t>
+              <w:t xml:space="preserve">15 de outubro de 2026</w:t>
             </w:r>
           </w:p>
         </w:tc>
@@ -4087,7 +4087,7 @@
                 <w:sz w:val="17"/>
                 <w:szCs w:val="17"/>
               </w:rPr>
-              <w:t xml:space="preserve">panorama_para_json</w:t>
+              <w:t xml:space="preserve">orgaos_para_busca</w:t>
             </w:r>
           </w:p>
         </w:tc>
@@ -4114,7 +4114,7 @@
                 <w:sz w:val="17"/>
                 <w:szCs w:val="17"/>
               </w:rPr>
-              <w:t xml:space="preserve">Brasil: esferas, UFs (governo do estado e municípios), meses, modalidades, 30 maiores fornecedores</w:t>
+              <w:t xml:space="preserve">Todo órgão com publicação no período: CNPJ, razão social, ente, esfera, processos e contratos</w:t>
             </w:r>
           </w:p>
         </w:tc>
@@ -4141,7 +4141,7 @@
                 <w:sz w:val="17"/>
                 <w:szCs w:val="17"/>
               </w:rPr>
-              <w:t xml:space="preserve">UFs em ordem alfabética; nada ordenado por risco</w:t>
+              <w:t xml:space="preserve">Para a busca do portal achar uma entidade pelo nome, pela sigla ou pelo CNPJ</w:t>
             </w:r>
           </w:p>
         </w:tc>
@@ -4174,6 +4174,93 @@
                 <w:sz w:val="17"/>
                 <w:szCs w:val="17"/>
               </w:rPr>
+              <w:t xml:space="preserve">panorama_para_json</w:t>
+            </w:r>
+          </w:p>
+        </w:tc>
+        <w:tc>
+          <w:tcPr>
+            <w:tcW w:type="dxa" w:w="3300"/>
+            <w:shd w:fill="FFFFFF" w:val="clear"/>
+            <w:tcMar>
+              <w:top w:type="dxa" w:w="70"/>
+              <w:left w:type="dxa" w:w="110"/>
+              <w:bottom w:type="dxa" w:w="70"/>
+              <w:right w:type="dxa" w:w="110"/>
+            </w:tcMar>
+            <w:vAlign w:val="center"/>
+          </w:tcPr>
+          <w:p>
+            <w:pPr>
+              <w:spacing w:after="0"/>
+            </w:pPr>
+            <w:r>
+              <w:rPr>
+                <w:b w:val="false"/>
+                <w:bCs w:val="false"/>
+                <w:sz w:val="17"/>
+                <w:szCs w:val="17"/>
+              </w:rPr>
+              <w:t xml:space="preserve">Brasil: esferas, UFs (governo do estado e municípios), meses, modalidades, 30 maiores fornecedores</w:t>
+            </w:r>
+          </w:p>
+        </w:tc>
+        <w:tc>
+          <w:tcPr>
+            <w:tcW w:type="dxa" w:w="3900"/>
+            <w:shd w:fill="FFFFFF" w:val="clear"/>
+            <w:tcMar>
+              <w:top w:type="dxa" w:w="70"/>
+              <w:left w:type="dxa" w:w="110"/>
+              <w:bottom w:type="dxa" w:w="70"/>
+              <w:right w:type="dxa" w:w="110"/>
+            </w:tcMar>
+            <w:vAlign w:val="center"/>
+          </w:tcPr>
+          <w:p>
+            <w:pPr>
+              <w:spacing w:after="0"/>
+            </w:pPr>
+            <w:r>
+              <w:rPr>
+                <w:b w:val="false"/>
+                <w:bCs w:val="false"/>
+                <w:sz w:val="17"/>
+                <w:szCs w:val="17"/>
+              </w:rPr>
+              <w:t xml:space="preserve">UFs em ordem alfabética; nada ordenado por risco</w:t>
+            </w:r>
+          </w:p>
+        </w:tc>
+      </w:tr>
+      <w:tr>
+        <w:trPr>
+          <w:cantSplit/>
+        </w:trPr>
+        <w:tc>
+          <w:tcPr>
+            <w:tcW w:type="dxa" w:w="2400"/>
+            <w:shd w:fill="F2F2F2" w:val="clear"/>
+            <w:tcMar>
+              <w:top w:type="dxa" w:w="70"/>
+              <w:left w:type="dxa" w:w="110"/>
+              <w:bottom w:type="dxa" w:w="70"/>
+              <w:right w:type="dxa" w:w="110"/>
+            </w:tcMar>
+            <w:vAlign w:val="center"/>
+          </w:tcPr>
+          <w:p>
+            <w:pPr>
+              <w:spacing w:after="0"/>
+            </w:pPr>
+            <w:r>
+              <w:rPr>
+                <w:rFonts w:ascii="Consolas" w:cs="Consolas" w:eastAsia="Consolas" w:hAnsi="Consolas"/>
+                <w:b w:val="false"/>
+                <w:bCs w:val="false"/>
+                <w:sz w:val="17"/>
+                <w:szCs w:val="17"/>
+              </w:rPr>
               <w:t xml:space="preserve">Painel.cobertura</w:t>
             </w:r>
           </w:p>
@@ -4181,7 +4268,7 @@
         <w:tc>
           <w:tcPr>
             <w:tcW w:type="dxa" w:w="3300"/>
-            <w:shd w:fill="FFFFFF" w:val="clear"/>
+            <w:shd w:fill="F2F2F2" w:val="clear"/>
             <w:tcMar>
               <w:top w:type="dxa" w:w="70"/>
               <w:left w:type="dxa" w:w="110"/>
@@ -4208,7 +4295,7 @@
         <w:tc>
           <w:tcPr>
             <w:tcW w:type="dxa" w:w="3900"/>
-            <w:shd w:fill="FFFFFF" w:val="clear"/>
+            <w:shd w:fill="F2F2F2" w:val="clear"/>
             <w:tcMar>
               <w:top w:type="dxa" w:w="70"/>
               <w:left w:type="dxa" w:w="110"/>
@@ -6529,7 +6616,7 @@
                 <w:sz w:val="17"/>
                 <w:szCs w:val="17"/>
               </w:rPr>
-              <w:t xml:space="preserve">contratacoes/panorama.json</w:t>
+              <w:t xml:space="preserve">orgaos.json</w:t>
             </w:r>
           </w:p>
         </w:tc>
@@ -6557,7 +6644,7 @@
                 <w:sz w:val="17"/>
                 <w:szCs w:val="17"/>
               </w:rPr>
-              <w:t xml:space="preserve">contratacoes-panorama</w:t>
+              <w:t xml:space="preserve">orgaos</w:t>
             </w:r>
           </w:p>
         </w:tc>
@@ -6584,7 +6671,7 @@
                 <w:sz w:val="17"/>
                 <w:szCs w:val="17"/>
               </w:rPr>
-              <w:t xml:space="preserve">Brasil: totais, esferas, UFs, meses, modalidades, fornecedores, recentes</w:t>
+              <w:t xml:space="preserve">Órgãos para a busca: CNPJ, razão social, ente, esfera, processos, contratos</w:t>
             </w:r>
           </w:p>
         </w:tc>
@@ -6617,7 +6704,7 @@
                 <w:sz w:val="17"/>
                 <w:szCs w:val="17"/>
               </w:rPr>
-              <w:t xml:space="preserve">contratacoes/ente/&lt;código&gt;.json</w:t>
+              <w:t xml:space="preserve">contratacoes/panorama.json</w:t>
             </w:r>
           </w:p>
         </w:tc>
@@ -6645,7 +6732,7 @@
                 <w:sz w:val="17"/>
                 <w:szCs w:val="17"/>
               </w:rPr>
-              <w:t xml:space="preserve">contratacoes-ente</w:t>
+              <w:t xml:space="preserve">contratacoes-panorama</w:t>
             </w:r>
           </w:p>
         </w:tc>
@@ -6672,7 +6759,7 @@
                 <w:sz w:val="17"/>
                 <w:szCs w:val="17"/>
               </w:rPr>
-              <w:t xml:space="preserve">Um ente; o de um estado com os municípios da UF</w:t>
+              <w:t xml:space="preserve">Brasil: totais, esferas, UFs, meses, modalidades, fornecedores, recentes</w:t>
             </w:r>
           </w:p>
         </w:tc>
@@ -6705,7 +6792,7 @@
                 <w:sz w:val="17"/>
                 <w:szCs w:val="17"/>
               </w:rPr>
-              <w:t xml:space="preserve">contratacoes/orgao/&lt;CNPJ&gt;.json</w:t>
+              <w:t xml:space="preserve">contratacoes/ente/&lt;código&gt;.json</w:t>
             </w:r>
           </w:p>
         </w:tc>
@@ -6733,7 +6820,7 @@
                 <w:sz w:val="17"/>
                 <w:szCs w:val="17"/>
               </w:rPr>
-              <w:t xml:space="preserve">contratacoes-orgao</w:t>
+              <w:t xml:space="preserve">contratacoes-ente</w:t>
             </w:r>
           </w:p>
         </w:tc>
@@ -6760,7 +6847,7 @@
                 <w:sz w:val="17"/>
                 <w:szCs w:val="17"/>
               </w:rPr>
-              <w:t xml:space="preserve">Um órgão, com o ente a que pertence</w:t>
+              <w:t xml:space="preserve">Um ente; o de um estado com os municípios da UF</w:t>
             </w:r>
           </w:p>
         </w:tc>
@@ -6793,7 +6880,7 @@
                 <w:sz w:val="17"/>
                 <w:szCs w:val="17"/>
               </w:rPr>
-              <w:t xml:space="preserve">conformidade/panorama.json</w:t>
+              <w:t xml:space="preserve">contratacoes/orgao/&lt;CNPJ&gt;.json</w:t>
             </w:r>
           </w:p>
         </w:tc>
@@ -6821,7 +6908,7 @@
                 <w:sz w:val="17"/>
                 <w:szCs w:val="17"/>
               </w:rPr>
-              <w:t xml:space="preserve">conformidade-panorama</w:t>
+              <w:t xml:space="preserve">contratacoes-orgao</w:t>
             </w:r>
           </w:p>
         </w:tc>
@@ -6848,7 +6935,7 @@
                 <w:sz w:val="17"/>
                 <w:szCs w:val="17"/>
               </w:rPr>
-              <w:t xml:space="preserve">Brasil, por obrigação e por UF</w:t>
+              <w:t xml:space="preserve">Um órgão, com o ente a que pertence</w:t>
             </w:r>
           </w:p>
         </w:tc>
@@ -6881,7 +6968,7 @@
                 <w:sz w:val="17"/>
                 <w:szCs w:val="17"/>
               </w:rPr>
-              <w:t xml:space="preserve">conformidade/uf/&lt;sigla&gt;.json</w:t>
+              <w:t xml:space="preserve">conformidade/panorama.json</w:t>
             </w:r>
           </w:p>
         </w:tc>
@@ -6909,7 +6996,7 @@
                 <w:sz w:val="17"/>
                 <w:szCs w:val="17"/>
               </w:rPr>
-              <w:t xml:space="preserve">conformidade-uf</w:t>
+              <w:t xml:space="preserve">conformidade-panorama</w:t>
             </w:r>
           </w:p>
         </w:tc>
@@ -6936,7 +7023,7 @@
                 <w:sz w:val="17"/>
                 <w:szCs w:val="17"/>
               </w:rPr>
-              <w:t xml:space="preserve">Entes da UF com o resumo de cada um</w:t>
+              <w:t xml:space="preserve">Brasil, por obrigação e por UF</w:t>
             </w:r>
           </w:p>
         </w:tc>
@@ -6969,7 +7056,7 @@
                 <w:sz w:val="17"/>
                 <w:szCs w:val="17"/>
               </w:rPr>
-              <w:t xml:space="preserve">conformidade/ente/&lt;código&gt;.json</w:t>
+              <w:t xml:space="preserve">conformidade/uf/&lt;sigla&gt;.json</w:t>
             </w:r>
           </w:p>
         </w:tc>
@@ -6997,7 +7084,7 @@
                 <w:sz w:val="17"/>
                 <w:szCs w:val="17"/>
               </w:rPr>
-              <w:t xml:space="preserve">conformidade-ente</w:t>
+              <w:t xml:space="preserve">conformidade-uf</w:t>
             </w:r>
           </w:p>
         </w:tc>
@@ -7005,6 +7092,94 @@
           <w:tcPr>
             <w:tcW w:type="dxa" w:w="4200"/>
             <w:shd w:fill="F2F2F2" w:val="clear"/>
+            <w:tcMar>
+              <w:top w:type="dxa" w:w="70"/>
+              <w:left w:type="dxa" w:w="110"/>
+              <w:bottom w:type="dxa" w:w="70"/>
+              <w:right w:type="dxa" w:w="110"/>
+            </w:tcMar>
+            <w:vAlign w:val="center"/>
+          </w:tcPr>
+          <w:p>
+            <w:pPr>
+              <w:spacing w:after="0"/>
+            </w:pPr>
+            <w:r>
+              <w:rPr>
+                <w:b w:val="false"/>
+                <w:bCs w:val="false"/>
+                <w:sz w:val="17"/>
+                <w:szCs w:val="17"/>
+              </w:rPr>
+              <w:t xml:space="preserve">Entes da UF com o resumo de cada um</w:t>
+            </w:r>
+          </w:p>
+        </w:tc>
+      </w:tr>
+      <w:tr>
+        <w:trPr>
+          <w:cantSplit/>
+        </w:trPr>
+        <w:tc>
+          <w:tcPr>
+            <w:tcW w:type="dxa" w:w="3200"/>
+            <w:shd w:fill="FFFFFF" w:val="clear"/>
+            <w:tcMar>
+              <w:top w:type="dxa" w:w="70"/>
+              <w:left w:type="dxa" w:w="110"/>
+              <w:bottom w:type="dxa" w:w="70"/>
+              <w:right w:type="dxa" w:w="110"/>
+            </w:tcMar>
+            <w:vAlign w:val="center"/>
+          </w:tcPr>
+          <w:p>
+            <w:pPr>
+              <w:spacing w:after="0"/>
+            </w:pPr>
+            <w:r>
+              <w:rPr>
+                <w:rFonts w:ascii="Consolas" w:cs="Consolas" w:eastAsia="Consolas" w:hAnsi="Consolas"/>
+                <w:b w:val="false"/>
+                <w:bCs w:val="false"/>
+                <w:sz w:val="17"/>
+                <w:szCs w:val="17"/>
+              </w:rPr>
+              <w:t xml:space="preserve">conformidade/ente/&lt;código&gt;.json</w:t>
+            </w:r>
+          </w:p>
+        </w:tc>
+        <w:tc>
+          <w:tcPr>
+            <w:tcW w:type="dxa" w:w="2200"/>
+            <w:shd w:fill="FFFFFF" w:val="clear"/>
+            <w:tcMar>
+              <w:top w:type="dxa" w:w="70"/>
+              <w:left w:type="dxa" w:w="110"/>
+              <w:bottom w:type="dxa" w:w="70"/>
+              <w:right w:type="dxa" w:w="110"/>
+            </w:tcMar>
+            <w:vAlign w:val="center"/>
+          </w:tcPr>
+          <w:p>
+            <w:pPr>
+              <w:spacing w:after="0"/>
+            </w:pPr>
+            <w:r>
+              <w:rPr>
+                <w:rFonts w:ascii="Consolas" w:cs="Consolas" w:eastAsia="Consolas" w:hAnsi="Consolas"/>
+                <w:b w:val="false"/>
+                <w:bCs w:val="false"/>
+                <w:sz w:val="17"/>
+                <w:szCs w:val="17"/>
+              </w:rPr>
+              <w:t xml:space="preserve">conformidade-ente</w:t>
+            </w:r>
+          </w:p>
+        </w:tc>
+        <w:tc>
+          <w:tcPr>
+            <w:tcW w:type="dxa" w:w="4200"/>
+            <w:shd w:fill="FFFFFF" w:val="clear"/>
             <w:tcMar>
               <w:top w:type="dxa" w:w="70"/>
               <w:left w:type="dxa" w:w="110"/>
@@ -8519,7 +8694,7 @@
                 <w:sz w:val="17"/>
                 <w:szCs w:val="17"/>
               </w:rPr>
-              <w:t xml:space="preserve">Endereços (com validação de código, CNPJ e UF antes de virar caminho), tipos dos arquivos, leitura com conferência de versão e tipo, busca de entes, formatos de reais, meses, datas e CNPJ</w:t>
+              <w:t xml:space="preserve">Endereços (com validação de código, CNPJ e UF antes de virar caminho), tipos dos arquivos, leitura com conferência de versão e tipo, busca de entes e de órgãos (nome, sigla pelas iniciais, município do órgão ou CNPJ), formatos de reais, meses, datas e CNPJ</w:t>
             </w:r>
           </w:p>
         </w:tc>
@@ -8579,7 +8754,7 @@
                 <w:sz w:val="17"/>
                 <w:szCs w:val="17"/>
               </w:rPr>
-              <w:t xml:space="preserve">Busca de ente (combobox com setas, Enter e Esc), aviso metodológico (PUB-08), número em destaque, gráfico de barras por mês com tabela recolhida, selo de resultado</w:t>
+              <w:t xml:space="preserve">Busca de ente e, em Contratações, de órgão (combobox com setas, Enter e Esc; "SAAE Sorocaba" acha o serviço autônomo de água e esgoto pela sigla e pelo município), aviso metodológico (PUB-08), número em destaque, gráfico de barras por mês com tabela recolhida, selo de resultado</w:t>
             </w:r>
           </w:p>
         </w:tc>
@@ -9867,7 +10042,7 @@
                 <w:sz w:val="17"/>
                 <w:szCs w:val="17"/>
               </w:rPr>
-              <w:t xml:space="preserve">28</w:t>
+              <w:t xml:space="preserve">29</w:t>
             </w:r>
           </w:p>
         </w:tc>
@@ -9953,7 +10128,7 @@
                 <w:sz w:val="17"/>
                 <w:szCs w:val="17"/>
               </w:rPr>
-              <w:t xml:space="preserve">7 novos</w:t>
+              <w:t xml:space="preserve">10 novos</w:t>
             </w:r>
           </w:p>
         </w:tc>
@@ -9980,7 +10155,7 @@
                 <w:sz w:val="17"/>
                 <w:szCs w:val="17"/>
               </w:rPr>
-              <w:t xml:space="preserve">Busca de entes, leitura do entes.json, validação de caminhos, conferência de versão e tipo, formatos e topo do eixo do gráfico</w:t>
+              <w:t xml:space="preserve">Busca de entes e de órgãos (sigla, município, CNPJ), leitura do entes.json e do orgaos.json, validação de caminhos, conferência de versão e tipo, formatos e topo do eixo do gráfico</w:t>
             </w:r>
           </w:p>
         </w:tc>

</xml_diff>

<commit_message>
Documentação: DOC-13 e DOC-11 com o teto de plausibilidade
</commit_message>
<xml_diff>
--- a/docs/DOC-13_Paineis.docx
+++ b/docs/DOC-13_Paineis.docx
@@ -4087,7 +4087,7 @@
                 <w:sz w:val="17"/>
                 <w:szCs w:val="17"/>
               </w:rPr>
-              <w:t xml:space="preserve">orgaos_para_busca</w:t>
+              <w:t xml:space="preserve">teto_do_ente</w:t>
             </w:r>
           </w:p>
         </w:tc>
@@ -4114,7 +4114,7 @@
                 <w:sz w:val="17"/>
                 <w:szCs w:val="17"/>
               </w:rPr>
-              <w:t xml:space="preserve">Todo órgão com publicação no período: CNPJ, razão social, ente, esfera, processos e contratos</w:t>
+              <w:t xml:space="preserve">Teto de plausibilidade de um processo ou contrato: R$ 10 bilhões ou R$ 20 mil por habitante do ente, o menor</w:t>
             </w:r>
           </w:p>
         </w:tc>
@@ -4141,7 +4141,7 @@
                 <w:sz w:val="17"/>
                 <w:szCs w:val="17"/>
               </w:rPr>
-              <w:t xml:space="preserve">Para a busca do portal achar uma entidade pelo nome, pela sigla ou pelo CNPJ</w:t>
+              <w:t xml:space="preserve">Acima dele, conta na quantidade e fica fora das somas, em "valores a conferir"</w:t>
             </w:r>
           </w:p>
         </w:tc>
@@ -4174,7 +4174,7 @@
                 <w:sz w:val="17"/>
                 <w:szCs w:val="17"/>
               </w:rPr>
-              <w:t xml:space="preserve">panorama_para_json</w:t>
+              <w:t xml:space="preserve">orgaos_para_busca</w:t>
             </w:r>
           </w:p>
         </w:tc>
@@ -4201,7 +4201,7 @@
                 <w:sz w:val="17"/>
                 <w:szCs w:val="17"/>
               </w:rPr>
-              <w:t xml:space="preserve">Brasil: esferas, UFs (governo do estado e municípios), meses, modalidades, 30 maiores fornecedores</w:t>
+              <w:t xml:space="preserve">Todo órgão com publicação no período: CNPJ, razão social, ente, esfera, processos e contratos</w:t>
             </w:r>
           </w:p>
         </w:tc>
@@ -4228,7 +4228,7 @@
                 <w:sz w:val="17"/>
                 <w:szCs w:val="17"/>
               </w:rPr>
-              <w:t xml:space="preserve">UFs em ordem alfabética; nada ordenado por risco</w:t>
+              <w:t xml:space="preserve">Para a busca do portal achar uma entidade pelo nome, pela sigla ou pelo CNPJ</w:t>
             </w:r>
           </w:p>
         </w:tc>
@@ -4261,7 +4261,7 @@
                 <w:sz w:val="17"/>
                 <w:szCs w:val="17"/>
               </w:rPr>
-              <w:t xml:space="preserve">Painel.cobertura</w:t>
+              <w:t xml:space="preserve">panorama_para_json</w:t>
             </w:r>
           </w:p>
         </w:tc>
@@ -4288,7 +4288,7 @@
                 <w:sz w:val="17"/>
                 <w:szCs w:val="17"/>
               </w:rPr>
-              <w:t xml:space="preserve">Primeiro e último dia, quantos e os que faltam entre eles</w:t>
+              <w:t xml:space="preserve">Brasil: esferas, UFs (governo do estado e municípios), meses, modalidades, 30 maiores fornecedores</w:t>
             </w:r>
           </w:p>
         </w:tc>
@@ -4296,6 +4296,93 @@
           <w:tcPr>
             <w:tcW w:type="dxa" w:w="3900"/>
             <w:shd w:fill="F2F2F2" w:val="clear"/>
+            <w:tcMar>
+              <w:top w:type="dxa" w:w="70"/>
+              <w:left w:type="dxa" w:w="110"/>
+              <w:bottom w:type="dxa" w:w="70"/>
+              <w:right w:type="dxa" w:w="110"/>
+            </w:tcMar>
+            <w:vAlign w:val="center"/>
+          </w:tcPr>
+          <w:p>
+            <w:pPr>
+              <w:spacing w:after="0"/>
+            </w:pPr>
+            <w:r>
+              <w:rPr>
+                <w:b w:val="false"/>
+                <w:bCs w:val="false"/>
+                <w:sz w:val="17"/>
+                <w:szCs w:val="17"/>
+              </w:rPr>
+              <w:t xml:space="preserve">UFs em ordem alfabética; nada ordenado por risco</w:t>
+            </w:r>
+          </w:p>
+        </w:tc>
+      </w:tr>
+      <w:tr>
+        <w:trPr>
+          <w:cantSplit/>
+        </w:trPr>
+        <w:tc>
+          <w:tcPr>
+            <w:tcW w:type="dxa" w:w="2400"/>
+            <w:shd w:fill="FFFFFF" w:val="clear"/>
+            <w:tcMar>
+              <w:top w:type="dxa" w:w="70"/>
+              <w:left w:type="dxa" w:w="110"/>
+              <w:bottom w:type="dxa" w:w="70"/>
+              <w:right w:type="dxa" w:w="110"/>
+            </w:tcMar>
+            <w:vAlign w:val="center"/>
+          </w:tcPr>
+          <w:p>
+            <w:pPr>
+              <w:spacing w:after="0"/>
+            </w:pPr>
+            <w:r>
+              <w:rPr>
+                <w:rFonts w:ascii="Consolas" w:cs="Consolas" w:eastAsia="Consolas" w:hAnsi="Consolas"/>
+                <w:b w:val="false"/>
+                <w:bCs w:val="false"/>
+                <w:sz w:val="17"/>
+                <w:szCs w:val="17"/>
+              </w:rPr>
+              <w:t xml:space="preserve">Painel.cobertura</w:t>
+            </w:r>
+          </w:p>
+        </w:tc>
+        <w:tc>
+          <w:tcPr>
+            <w:tcW w:type="dxa" w:w="3300"/>
+            <w:shd w:fill="FFFFFF" w:val="clear"/>
+            <w:tcMar>
+              <w:top w:type="dxa" w:w="70"/>
+              <w:left w:type="dxa" w:w="110"/>
+              <w:bottom w:type="dxa" w:w="70"/>
+              <w:right w:type="dxa" w:w="110"/>
+            </w:tcMar>
+            <w:vAlign w:val="center"/>
+          </w:tcPr>
+          <w:p>
+            <w:pPr>
+              <w:spacing w:after="0"/>
+            </w:pPr>
+            <w:r>
+              <w:rPr>
+                <w:b w:val="false"/>
+                <w:bCs w:val="false"/>
+                <w:sz w:val="17"/>
+                <w:szCs w:val="17"/>
+              </w:rPr>
+              <w:t xml:space="preserve">Primeiro e último dia, quantos e os que faltam entre eles</w:t>
+            </w:r>
+          </w:p>
+        </w:tc>
+        <w:tc>
+          <w:tcPr>
+            <w:tcW w:type="dxa" w:w="3900"/>
+            <w:shd w:fill="FFFFFF" w:val="clear"/>
             <w:tcMar>
               <w:top w:type="dxa" w:w="70"/>
               <w:left w:type="dxa" w:w="110"/>
@@ -7273,7 +7360,60 @@
         <w:t xml:space="preserve">Valores como publicados.</w:t>
       </w:r>
       <w:r>
-        <w:t xml:space="preserve"> Valor estimado sigiloso ou zerado conta como processo sem valor; um valor digitado errado pelo órgão entra como veio. O painel não corrige nem descarta valores, e o aviso metodológico diz isso.</w:t>
+        <w:t xml:space="preserve"> Valor estimado sigiloso ou zerado conta como processo sem valor. O painel não corrige valores.</w:t>
+      </w:r>
+    </w:p>
+    <w:p>
+      <w:pPr>
+        <w:pStyle w:val="ListParagraph"/>
+        <w:numPr>
+          <w:ilvl w:val="0"/>
+          <w:numId w:val="3"/>
+        </w:numPr>
+        <w:spacing w:after="70"/>
+      </w:pPr>
+      <w:r>
+        <w:rPr>
+          <w:b/>
+          <w:bCs/>
+        </w:rPr>
+        <w:t xml:space="preserve">Teto de plausibilidade.</w:t>
+      </w:r>
+      <w:r>
+        <w:t xml:space="preserve"> Processo ou contrato com valor acima de R$ 10 bilhões, ou de R$ 20 mil por habitante do ente (perto de quatro anos do orçamento por habitante de um município médio), o que for menor, conta nas quantidades, mas o valor fica fora de todas as somas (ente, órgão, mês, modalidade, esfera, UF, fornecedor) e aparece na seção "Valores a conferir na fonte", com o link da publicação. Motivo: na primeira semana coletada, um único contrato publicado com R$ 239,8 bilhões (e outro com R$ 17,7 bilhões) fazia 97% do valor de contratos do país e punha uma empresa pequena no topo da lista de fornecedores. Não é juízo sobre o órgão nem sobre o fornecedor; o aviso metodológico e a própria seção dizem isso. Função </w:t>
+      </w:r>
+      <w:r>
+        <w:rPr>
+          <w:rFonts w:ascii="Consolas" w:cs="Consolas" w:eastAsia="Consolas" w:hAnsi="Consolas"/>
+          <w:sz w:val="19"/>
+          <w:szCs w:val="19"/>
+        </w:rPr>
+        <w:t xml:space="preserve">teto_do_ente</w:t>
+      </w:r>
+      <w:r>
+        <w:t xml:space="preserve">; constantes </w:t>
+      </w:r>
+      <w:r>
+        <w:rPr>
+          <w:rFonts w:ascii="Consolas" w:cs="Consolas" w:eastAsia="Consolas" w:hAnsi="Consolas"/>
+          <w:sz w:val="19"/>
+          <w:szCs w:val="19"/>
+        </w:rPr>
+        <w:t xml:space="preserve">TETO_ABSOLUTO</w:t>
+      </w:r>
+      <w:r>
+        <w:t xml:space="preserve"> e </w:t>
+      </w:r>
+      <w:r>
+        <w:rPr>
+          <w:rFonts w:ascii="Consolas" w:cs="Consolas" w:eastAsia="Consolas" w:hAnsi="Consolas"/>
+          <w:sz w:val="19"/>
+          <w:szCs w:val="19"/>
+        </w:rPr>
+        <w:t xml:space="preserve">TETO_POR_HABITANTE</w:t>
+      </w:r>
+      <w:r>
+        <w:t xml:space="preserve">.</w:t>
       </w:r>
     </w:p>
     <w:p>
@@ -10042,7 +10182,7 @@
                 <w:sz w:val="17"/>
                 <w:szCs w:val="17"/>
               </w:rPr>
-              <w:t xml:space="preserve">29</w:t>
+              <w:t xml:space="preserve">30</w:t>
             </w:r>
           </w:p>
         </w:tc>
@@ -10603,7 +10743,7 @@
                 <w:sz w:val="17"/>
                 <w:szCs w:val="17"/>
               </w:rPr>
-              <w:t xml:space="preserve">Um valor estimado absurdo distorce a soma de um ente; marcar (sem excluir) valores fora de escala é decisão metodológica</w:t>
+              <w:t xml:space="preserve">Valores acima do teto já ficam fora das somas (seção 7); erro menor que o teto (um contrato de R$ 50 mil digitado como R$ 50 milhões numa capital) ainda entra. Comparar com o valor estimado do processo do mesmo contrato é o próximo passo</w:t>
             </w:r>
           </w:p>
         </w:tc>

</xml_diff>

<commit_message>
Painéis: implantação do Pages em 30 minutos; emendas e convênios por grupo de entes
A publicação do site dos painéis de 20/10/2026 falhou no deploy-pages, que
estourou o prazo padrão de 10 minutos: a implantação demora com o número de
arquivos, perto de 30 mil. O paineis-site passa a dar 30 minutos à
implantação e 60 ao job.

As emendas (ADR-044) e os convênios (ADR-045) vão para o site em arquivos por
grupo de entes (os 3 primeiros dígitos do município, ou o código da UF), perto
de 560 arquivos em vez de 11 mil; o portal acha o ente dentro do grupo.
</commit_message>
<xml_diff>
--- a/docs/DOC-13_Paineis.docx
+++ b/docs/DOC-13_Paineis.docx
@@ -9999,7 +9999,7 @@
                 <w:sz w:val="17"/>
                 <w:szCs w:val="17"/>
               </w:rPr>
-              <w:t xml:space="preserve">emendas/ente/&lt;código IBGE&gt;.json.gz</w:t>
+              <w:t xml:space="preserve">emendas/ente/&lt;grupo&gt;.json.gz (3 primeiros dígitos do município, ou a UF)</w:t>
             </w:r>
           </w:p>
         </w:tc>
@@ -10026,7 +10026,7 @@
                 <w:sz w:val="17"/>
                 <w:szCs w:val="17"/>
               </w:rPr>
-              <w:t xml:space="preserve">Comprimido; lido pelo mandato aberto em Governos municipais</w:t>
+              <w:t xml:space="preserve">Comprimido e em grupos de perto de 20 municípios, para a implantação do Pages caber no prazo; lido pelo mandato aberto em Governos municipais</w:t>
             </w:r>
           </w:p>
         </w:tc>
@@ -10380,7 +10380,7 @@
                 <w:sz w:val="17"/>
                 <w:szCs w:val="17"/>
               </w:rPr>
-              <w:t xml:space="preserve">convenios/ente/&lt;código IBGE&gt;.json.gz</w:t>
+              <w:t xml:space="preserve">convenios/ente/&lt;grupo&gt;.json.gz (3 primeiros dígitos do município, ou a UF)</w:t>
             </w:r>
           </w:p>
         </w:tc>
@@ -10407,7 +10407,7 @@
                 <w:sz w:val="17"/>
                 <w:szCs w:val="17"/>
               </w:rPr>
-              <w:t xml:space="preserve">Comprimido; lido pelo mandato aberto em Governos municipais</w:t>
+              <w:t xml:space="preserve">Comprimido e em grupos, como as emendas; lido pelo mandato aberto em Governos municipais</w:t>
             </w:r>
           </w:p>
         </w:tc>

</xml_diff>

<commit_message>
Painéis: contratações em arquivos por grupo de entes e de órgãos (ADR-028, adendo)
- contratacoes/ente/<grupo>.json.gz e contratacoes/orgao/<grupo>.json.gz, comprimidos:
  o grupo é o 3º, o 4º e o 5º dígitos do município (723 grupos, de 1 a 46) e o 6º, o 7º
  e o 8º do CNPJ (mil grupos, até 48 órgãos). Eram 25 mil arquivos.
- Emendas e convênios passam ao mesmo grupo de entes (os 3 primeiros dígitos davam
  grupos de até 345 municípios).
- O portal lê o ente e o órgão no arquivo do grupo e, até a próxima publicação do site,
  o arquivo antigo quando o grupo ainda não existe.
</commit_message>
<xml_diff>
--- a/docs/DOC-13_Paineis.docx
+++ b/docs/DOC-13_Paineis.docx
@@ -267,7 +267,7 @@
                 <w:sz w:val="19"/>
                 <w:szCs w:val="19"/>
               </w:rPr>
-              <w:t xml:space="preserve">1.9</w:t>
+              <w:t xml:space="preserve">2.0</w:t>
             </w:r>
           </w:p>
         </w:tc>
@@ -9999,7 +9999,7 @@
                 <w:sz w:val="17"/>
                 <w:szCs w:val="17"/>
               </w:rPr>
-              <w:t xml:space="preserve">emendas/ente/&lt;grupo&gt;.json.gz (3 primeiros dígitos do município, ou a UF)</w:t>
+              <w:t xml:space="preserve">emendas/ente/&lt;grupo&gt;.json.gz (3º a 5º dígitos do município, ou a UF)</w:t>
             </w:r>
           </w:p>
         </w:tc>
@@ -10026,7 +10026,7 @@
                 <w:sz w:val="17"/>
                 <w:szCs w:val="17"/>
               </w:rPr>
-              <w:t xml:space="preserve">Comprimido e em grupos de perto de 20 municípios, para a implantação do Pages caber no prazo; lido pelo mandato aberto em Governos municipais</w:t>
+              <w:t xml:space="preserve">Comprimido e em grupos de 1 a 46 municípios, para a implantação do Pages caber no prazo; lido pelo mandato aberto em Governos municipais</w:t>
             </w:r>
           </w:p>
         </w:tc>
@@ -10380,7 +10380,7 @@
                 <w:sz w:val="17"/>
                 <w:szCs w:val="17"/>
               </w:rPr>
-              <w:t xml:space="preserve">convenios/ente/&lt;grupo&gt;.json.gz (3 primeiros dígitos do município, ou a UF)</w:t>
+              <w:t xml:space="preserve">convenios/ente/&lt;grupo&gt;.json.gz (3º a 5º dígitos do município, ou a UF)</w:t>
             </w:r>
           </w:p>
         </w:tc>
@@ -11956,7 +11956,7 @@
                 <w:sz w:val="17"/>
                 <w:szCs w:val="17"/>
               </w:rPr>
-              <w:t xml:space="preserve">contratacoes/ente/&lt;código&gt;.json</w:t>
+              <w:t xml:space="preserve">contratacoes/ente/&lt;grupo&gt;.json.gz</w:t>
             </w:r>
           </w:p>
         </w:tc>
@@ -11984,7 +11984,7 @@
                 <w:sz w:val="17"/>
                 <w:szCs w:val="17"/>
               </w:rPr>
-              <w:t xml:space="preserve">contratacoes-ente</w:t>
+              <w:t xml:space="preserve">contratacoes-entes</w:t>
             </w:r>
           </w:p>
         </w:tc>
@@ -12011,7 +12011,7 @@
                 <w:sz w:val="17"/>
                 <w:szCs w:val="17"/>
               </w:rPr>
-              <w:t xml:space="preserve">Um ente; o de um estado com os municípios da UF</w:t>
+              <w:t xml:space="preserve">Os entes do grupo (3º a 5º dígitos do município, ou o código), cada um como contratacoes-ente; o de um estado com os municípios da UF. Comprimido</w:t>
             </w:r>
           </w:p>
         </w:tc>
@@ -12044,7 +12044,7 @@
                 <w:sz w:val="17"/>
                 <w:szCs w:val="17"/>
               </w:rPr>
-              <w:t xml:space="preserve">contratacoes/orgao/&lt;CNPJ&gt;.json</w:t>
+              <w:t xml:space="preserve">contratacoes/orgao/&lt;grupo&gt;.json.gz</w:t>
             </w:r>
           </w:p>
         </w:tc>
@@ -12072,7 +12072,7 @@
                 <w:sz w:val="17"/>
                 <w:szCs w:val="17"/>
               </w:rPr>
-              <w:t xml:space="preserve">contratacoes-orgao</w:t>
+              <w:t xml:space="preserve">contratacoes-orgaos</w:t>
             </w:r>
           </w:p>
         </w:tc>
@@ -12099,7 +12099,7 @@
                 <w:sz w:val="17"/>
                 <w:szCs w:val="17"/>
               </w:rPr>
-              <w:t xml:space="preserve">Um órgão, com o ente a que pertence</w:t>
+              <w:t xml:space="preserve">Os órgãos do grupo (6º a 8º dígitos do CNPJ), cada um como contratacoes-orgao, com o ente a que pertence. Comprimido</w:t>
             </w:r>
           </w:p>
         </w:tc>

</xml_diff>

<commit_message>
Empresa ou entidade pelo CNPJ: a visão 360 (ADR-049)
- pj/<grupo>.json.gz, gerado pelo publicar: por CNPJ, os contratos no PNCP por ente
  contratante e ano, as emendas recebidas por ente e ano e os convênios com a União.
  O grupo é o 6º ao 8º dígitos (comum.grupo_do_cnpj, antes grupo_do_orgao).
- Página /pessoa-juridica/?cnpj=…: cartão da Receita, contratos por ano e por ente
  (com o link para as Contratações do ente filtradas pelo fornecedor), emendas e
  convênios. Fatos das fontes, sem marca nem ordem por risco.
- Links: "em todos os entes" no filtro de fornecedor das Contratações; o favorecido
  das emendas e o convenente dos convênios, em Governos municipais, abrem a página.
</commit_message>
<xml_diff>
--- a/docs/DOC-13_Paineis.docx
+++ b/docs/DOC-13_Paineis.docx
@@ -267,7 +267,7 @@
                 <w:sz w:val="19"/>
                 <w:szCs w:val="19"/>
               </w:rPr>
-              <w:t xml:space="preserve">2.1</w:t>
+              <w:t xml:space="preserve">2.2</w:t>
             </w:r>
           </w:p>
         </w:tc>
@@ -915,14 +915,15 @@
         </w:p>
         <w:p>
           <w:pPr>
-            <w:pStyle w:val="TOC1"/>
+            <w:pStyle w:val="TOC2"/>
             <w:tabs>
               <w:tab w:val="right" w:pos="9638" w:leader="dot"/>
             </w:tabs>
+            <w:ind w:left="220"/>
           </w:pPr>
           <w:hyperlink w:history="1" w:anchor="_Toc21">
             <w:r>
-              <w:t xml:space="preserve">5. Estado guardado entre execuções</w:t>
+              <w:t xml:space="preserve">4.16 pessoas_juridicas.py</w:t>
             </w:r>
             <w:r>
               <w:tab/>
@@ -944,7 +945,7 @@
           </w:pPr>
           <w:hyperlink w:history="1" w:anchor="_Toc22">
             <w:r>
-              <w:t xml:space="preserve">6. Site publicado</w:t>
+              <w:t xml:space="preserve">5. Estado guardado entre execuções</w:t>
             </w:r>
             <w:r>
               <w:tab/>
@@ -966,7 +967,7 @@
           </w:pPr>
           <w:hyperlink w:history="1" w:anchor="_Toc23">
             <w:r>
-              <w:t xml:space="preserve">7. Regras de soma das contratações</w:t>
+              <w:t xml:space="preserve">6. Site publicado</w:t>
             </w:r>
             <w:r>
               <w:tab/>
@@ -988,7 +989,7 @@
           </w:pPr>
           <w:hyperlink w:history="1" w:anchor="_Toc24">
             <w:r>
-              <w:t xml:space="preserve">8. Avaliação da conformidade</w:t>
+              <w:t xml:space="preserve">7. Regras de soma das contratações</w:t>
             </w:r>
             <w:r>
               <w:tab/>
@@ -996,6 +997,28 @@
             <w:r>
               <w:fldChar w:fldCharType="begin" w:dirty="true"/>
               <w:instrText xml:space="preserve">PAGEREF _Toc24 \h</w:instrText>
+              <w:fldChar w:fldCharType="separate"/>
+              <w:fldChar w:fldCharType="end"/>
+            </w:r>
+          </w:hyperlink>
+        </w:p>
+        <w:p>
+          <w:pPr>
+            <w:pStyle w:val="TOC1"/>
+            <w:tabs>
+              <w:tab w:val="right" w:pos="9638" w:leader="dot"/>
+            </w:tabs>
+          </w:pPr>
+          <w:hyperlink w:history="1" w:anchor="_Toc25">
+            <w:r>
+              <w:t xml:space="preserve">8. Avaliação da conformidade</w:t>
+            </w:r>
+            <w:r>
+              <w:tab/>
+            </w:r>
+            <w:r>
+              <w:fldChar w:fldCharType="begin" w:dirty="true"/>
+              <w:instrText xml:space="preserve">PAGEREF _Toc25 \h</w:instrText>
               <w:fldChar w:fldCharType="separate"/>
               <w:fldChar w:fldCharType="end"/>
             </w:r>
@@ -1009,31 +1032,9 @@
             </w:tabs>
             <w:ind w:left="220"/>
           </w:pPr>
-          <w:hyperlink w:history="1" w:anchor="_Toc25">
+          <w:hyperlink w:history="1" w:anchor="_Toc26">
             <w:r>
               <w:t xml:space="preserve">8.1 Comparação com o grupo de pares (ADR-038)</w:t>
-            </w:r>
-            <w:r>
-              <w:tab/>
-            </w:r>
-            <w:r>
-              <w:fldChar w:fldCharType="begin" w:dirty="true"/>
-              <w:instrText xml:space="preserve">PAGEREF _Toc25 \h</w:instrText>
-              <w:fldChar w:fldCharType="separate"/>
-              <w:fldChar w:fldCharType="end"/>
-            </w:r>
-          </w:hyperlink>
-        </w:p>
-        <w:p>
-          <w:pPr>
-            <w:pStyle w:val="TOC1"/>
-            <w:tabs>
-              <w:tab w:val="right" w:pos="9638" w:leader="dot"/>
-            </w:tabs>
-          </w:pPr>
-          <w:hyperlink w:history="1" w:anchor="_Toc26">
-            <w:r>
-              <w:t xml:space="preserve">9. Portal</w:t>
             </w:r>
             <w:r>
               <w:tab/>
@@ -1055,7 +1056,7 @@
           </w:pPr>
           <w:hyperlink w:history="1" w:anchor="_Toc27">
             <w:r>
-              <w:t xml:space="preserve">10. Operação</w:t>
+              <w:t xml:space="preserve">9. Portal</w:t>
             </w:r>
             <w:r>
               <w:tab/>
@@ -1070,15 +1071,14 @@
         </w:p>
         <w:p>
           <w:pPr>
-            <w:pStyle w:val="TOC3"/>
+            <w:pStyle w:val="TOC1"/>
             <w:tabs>
               <w:tab w:val="right" w:pos="9638" w:leader="dot"/>
             </w:tabs>
-            <w:ind w:left="440"/>
           </w:pPr>
           <w:hyperlink w:history="1" w:anchor="_Toc28">
             <w:r>
-              <w:t xml:space="preserve">Configuração, uma vez</w:t>
+              <w:t xml:space="preserve">10. Operação</w:t>
             </w:r>
             <w:r>
               <w:tab/>
@@ -1101,7 +1101,7 @@
           </w:pPr>
           <w:hyperlink w:history="1" w:anchor="_Toc29">
             <w:r>
-              <w:t xml:space="preserve">Comandos locais</w:t>
+              <w:t xml:space="preserve">Configuração, uma vez</w:t>
             </w:r>
             <w:r>
               <w:tab/>
@@ -1124,7 +1124,7 @@
           </w:pPr>
           <w:hyperlink w:history="1" w:anchor="_Toc30">
             <w:r>
-              <w:t xml:space="preserve">Limites</w:t>
+              <w:t xml:space="preserve">Comandos locais</w:t>
             </w:r>
             <w:r>
               <w:tab/>
@@ -1139,14 +1139,15 @@
         </w:p>
         <w:p>
           <w:pPr>
-            <w:pStyle w:val="TOC1"/>
+            <w:pStyle w:val="TOC3"/>
             <w:tabs>
               <w:tab w:val="right" w:pos="9638" w:leader="dot"/>
             </w:tabs>
+            <w:ind w:left="440"/>
           </w:pPr>
           <w:hyperlink w:history="1" w:anchor="_Toc31">
             <w:r>
-              <w:t xml:space="preserve">11. Verificação</w:t>
+              <w:t xml:space="preserve">Limites</w:t>
             </w:r>
             <w:r>
               <w:tab/>
@@ -1168,7 +1169,7 @@
           </w:pPr>
           <w:hyperlink w:history="1" w:anchor="_Toc32">
             <w:r>
-              <w:t xml:space="preserve">12. Próximos passos e riscos</w:t>
+              <w:t xml:space="preserve">11. Verificação</w:t>
             </w:r>
             <w:r>
               <w:tab/>
@@ -1176,6 +1177,28 @@
             <w:r>
               <w:fldChar w:fldCharType="begin" w:dirty="true"/>
               <w:instrText xml:space="preserve">PAGEREF _Toc32 \h</w:instrText>
+              <w:fldChar w:fldCharType="separate"/>
+              <w:fldChar w:fldCharType="end"/>
+            </w:r>
+          </w:hyperlink>
+        </w:p>
+        <w:p>
+          <w:pPr>
+            <w:pStyle w:val="TOC1"/>
+            <w:tabs>
+              <w:tab w:val="right" w:pos="9638" w:leader="dot"/>
+            </w:tabs>
+          </w:pPr>
+          <w:hyperlink w:history="1" w:anchor="_Toc33">
+            <w:r>
+              <w:t xml:space="preserve">12. Próximos passos e riscos</w:t>
+            </w:r>
+            <w:r>
+              <w:tab/>
+            </w:r>
+            <w:r>
+              <w:fldChar w:fldCharType="begin" w:dirty="true"/>
+              <w:instrText xml:space="preserve">PAGEREF _Toc33 \h</w:instrText>
               <w:fldChar w:fldCharType="separate"/>
               <w:fldChar w:fldCharType="end"/>
             </w:r>
@@ -10827,16 +10850,397 @@
     </w:tbl>
     <w:p>
       <w:pPr>
+        <w:pStyle w:val="Heading2"/>
+        <w:keepNext/>
+        <w:keepLines/>
+        <w:spacing w:after="120" w:before="280"/>
+      </w:pPr>
+      <w:bookmarkStart w:name="_Toc21" w:id="21"/>
+      <w:r>
+        <w:t xml:space="preserve">4.16 pessoas_juridicas.py</w:t>
+      </w:r>
+      <w:bookmarkEnd w:id="21"/>
+    </w:p>
+    <w:tbl>
+      <w:tblPr>
+        <w:tblW w:type="dxa" w:w="9600"/>
+        <w:tblBorders>
+          <w:top w:val="single" w:color="BFBFBF" w:sz="4"/>
+          <w:left w:val="single" w:color="BFBFBF" w:sz="4"/>
+          <w:bottom w:val="single" w:color="BFBFBF" w:sz="4"/>
+          <w:right w:val="single" w:color="BFBFBF" w:sz="4"/>
+          <w:insideH w:val="single" w:color="D9D9D9" w:sz="2"/>
+          <w:insideV w:val="single" w:color="D9D9D9" w:sz="2"/>
+        </w:tblBorders>
+      </w:tblPr>
+      <w:tblGrid>
+        <w:gridCol w:w="2400"/>
+        <w:gridCol w:w="3300"/>
+        <w:gridCol w:w="3900"/>
+      </w:tblGrid>
+      <w:tr>
+        <w:trPr>
+          <w:tblHeader/>
+        </w:trPr>
+        <w:tc>
+          <w:tcPr>
+            <w:tcW w:type="dxa" w:w="2400"/>
+            <w:shd w:fill="1F3864" w:val="clear"/>
+            <w:tcMar>
+              <w:top w:type="dxa" w:w="80"/>
+              <w:left w:type="dxa" w:w="110"/>
+              <w:bottom w:type="dxa" w:w="80"/>
+              <w:right w:type="dxa" w:w="110"/>
+            </w:tcMar>
+            <w:vAlign w:val="center"/>
+          </w:tcPr>
+          <w:p>
+            <w:pPr>
+              <w:spacing w:after="0"/>
+            </w:pPr>
+            <w:r>
+              <w:rPr>
+                <w:b/>
+                <w:bCs/>
+                <w:color w:val="FFFFFF"/>
+                <w:sz w:val="19"/>
+                <w:szCs w:val="19"/>
+              </w:rPr>
+              <w:t xml:space="preserve">Nome</w:t>
+            </w:r>
+          </w:p>
+        </w:tc>
+        <w:tc>
+          <w:tcPr>
+            <w:tcW w:type="dxa" w:w="3300"/>
+            <w:shd w:fill="1F3864" w:val="clear"/>
+            <w:tcMar>
+              <w:top w:type="dxa" w:w="80"/>
+              <w:left w:type="dxa" w:w="110"/>
+              <w:bottom w:type="dxa" w:w="80"/>
+              <w:right w:type="dxa" w:w="110"/>
+            </w:tcMar>
+            <w:vAlign w:val="center"/>
+          </w:tcPr>
+          <w:p>
+            <w:pPr>
+              <w:spacing w:after="0"/>
+            </w:pPr>
+            <w:r>
+              <w:rPr>
+                <w:b/>
+                <w:bCs/>
+                <w:color w:val="FFFFFF"/>
+                <w:sz w:val="19"/>
+                <w:szCs w:val="19"/>
+              </w:rPr>
+              <w:t xml:space="preserve">O que faz</w:t>
+            </w:r>
+          </w:p>
+        </w:tc>
+        <w:tc>
+          <w:tcPr>
+            <w:tcW w:type="dxa" w:w="3900"/>
+            <w:shd w:fill="1F3864" w:val="clear"/>
+            <w:tcMar>
+              <w:top w:type="dxa" w:w="80"/>
+              <w:left w:type="dxa" w:w="110"/>
+              <w:bottom w:type="dxa" w:w="80"/>
+              <w:right w:type="dxa" w:w="110"/>
+            </w:tcMar>
+            <w:vAlign w:val="center"/>
+          </w:tcPr>
+          <w:p>
+            <w:pPr>
+              <w:spacing w:after="0"/>
+            </w:pPr>
+            <w:r>
+              <w:rPr>
+                <w:b/>
+                <w:bCs/>
+                <w:color w:val="FFFFFF"/>
+                <w:sz w:val="19"/>
+                <w:szCs w:val="19"/>
+              </w:rPr>
+              <w:t xml:space="preserve">Como e por quê</w:t>
+            </w:r>
+          </w:p>
+        </w:tc>
+      </w:tr>
+      <w:tr>
+        <w:trPr>
+          <w:cantSplit/>
+        </w:trPr>
+        <w:tc>
+          <w:tcPr>
+            <w:tcW w:type="dxa" w:w="2400"/>
+            <w:shd w:fill="FFFFFF" w:val="clear"/>
+            <w:tcMar>
+              <w:top w:type="dxa" w:w="70"/>
+              <w:left w:type="dxa" w:w="110"/>
+              <w:bottom w:type="dxa" w:w="70"/>
+              <w:right w:type="dxa" w:w="110"/>
+            </w:tcMar>
+            <w:vAlign w:val="center"/>
+          </w:tcPr>
+          <w:p>
+            <w:pPr>
+              <w:spacing w:after="0"/>
+            </w:pPr>
+            <w:r>
+              <w:rPr>
+                <w:rFonts w:ascii="Consolas" w:cs="Consolas" w:eastAsia="Consolas" w:hAnsi="Consolas"/>
+                <w:b w:val="false"/>
+                <w:bCs w:val="false"/>
+                <w:sz w:val="17"/>
+                <w:szCs w:val="17"/>
+              </w:rPr>
+              <w:t xml:space="preserve">de_contratacoes</w:t>
+            </w:r>
+          </w:p>
+        </w:tc>
+        <w:tc>
+          <w:tcPr>
+            <w:tcW w:type="dxa" w:w="3300"/>
+            <w:shd w:fill="FFFFFF" w:val="clear"/>
+            <w:tcMar>
+              <w:top w:type="dxa" w:w="70"/>
+              <w:left w:type="dxa" w:w="110"/>
+              <w:bottom w:type="dxa" w:w="70"/>
+              <w:right w:type="dxa" w:w="110"/>
+            </w:tcMar>
+            <w:vAlign w:val="center"/>
+          </w:tcPr>
+          <w:p>
+            <w:pPr>
+              <w:spacing w:after="0"/>
+            </w:pPr>
+            <w:r>
+              <w:rPr>
+                <w:b w:val="false"/>
+                <w:bCs w:val="false"/>
+                <w:sz w:val="17"/>
+                <w:szCs w:val="17"/>
+              </w:rPr>
+              <w:t xml:space="preserve">Os contratos de cada fornecedor pessoa jurídica por ente contratante e ano</w:t>
+            </w:r>
+          </w:p>
+        </w:tc>
+        <w:tc>
+          <w:tcPr>
+            <w:tcW w:type="dxa" w:w="3900"/>
+            <w:shd w:fill="FFFFFF" w:val="clear"/>
+            <w:tcMar>
+              <w:top w:type="dxa" w:w="70"/>
+              <w:left w:type="dxa" w:w="110"/>
+              <w:bottom w:type="dxa" w:w="70"/>
+              <w:right w:type="dxa" w:w="110"/>
+            </w:tcMar>
+            <w:vAlign w:val="center"/>
+          </w:tcPr>
+          <w:p>
+            <w:pPr>
+              <w:spacing w:after="0"/>
+            </w:pPr>
+            <w:r>
+              <w:rPr>
+                <w:b w:val="false"/>
+                <w:bCs w:val="false"/>
+                <w:sz w:val="17"/>
+                <w:szCs w:val="17"/>
+              </w:rPr>
+              <w:t xml:space="preserve">Da mesma soma do painel; o valor a conferir conta e não soma</w:t>
+            </w:r>
+          </w:p>
+        </w:tc>
+      </w:tr>
+      <w:tr>
+        <w:trPr>
+          <w:cantSplit/>
+        </w:trPr>
+        <w:tc>
+          <w:tcPr>
+            <w:tcW w:type="dxa" w:w="2400"/>
+            <w:shd w:fill="F2F2F2" w:val="clear"/>
+            <w:tcMar>
+              <w:top w:type="dxa" w:w="70"/>
+              <w:left w:type="dxa" w:w="110"/>
+              <w:bottom w:type="dxa" w:w="70"/>
+              <w:right w:type="dxa" w:w="110"/>
+            </w:tcMar>
+            <w:vAlign w:val="center"/>
+          </w:tcPr>
+          <w:p>
+            <w:pPr>
+              <w:spacing w:after="0"/>
+            </w:pPr>
+            <w:r>
+              <w:rPr>
+                <w:rFonts w:ascii="Consolas" w:cs="Consolas" w:eastAsia="Consolas" w:hAnsi="Consolas"/>
+                <w:b w:val="false"/>
+                <w:bCs w:val="false"/>
+                <w:sz w:val="17"/>
+                <w:szCs w:val="17"/>
+              </w:rPr>
+              <w:t xml:space="preserve">de_convenios, de_emendas</w:t>
+            </w:r>
+          </w:p>
+        </w:tc>
+        <w:tc>
+          <w:tcPr>
+            <w:tcW w:type="dxa" w:w="3300"/>
+            <w:shd w:fill="F2F2F2" w:val="clear"/>
+            <w:tcMar>
+              <w:top w:type="dxa" w:w="70"/>
+              <w:left w:type="dxa" w:w="110"/>
+              <w:bottom w:type="dxa" w:w="70"/>
+              <w:right w:type="dxa" w:w="110"/>
+            </w:tcMar>
+            <w:vAlign w:val="center"/>
+          </w:tcPr>
+          <w:p>
+            <w:pPr>
+              <w:spacing w:after="0"/>
+            </w:pPr>
+            <w:r>
+              <w:rPr>
+                <w:b w:val="false"/>
+                <w:bCs w:val="false"/>
+                <w:sz w:val="17"/>
+                <w:szCs w:val="17"/>
+              </w:rPr>
+              <w:t xml:space="preserve">Os convênios como convenente e o recebido de emendas como favorecido</w:t>
+            </w:r>
+          </w:p>
+        </w:tc>
+        <w:tc>
+          <w:tcPr>
+            <w:tcW w:type="dxa" w:w="3900"/>
+            <w:shd w:fill="F2F2F2" w:val="clear"/>
+            <w:tcMar>
+              <w:top w:type="dxa" w:w="70"/>
+              <w:left w:type="dxa" w:w="110"/>
+              <w:bottom w:type="dxa" w:w="70"/>
+              <w:right w:type="dxa" w:w="110"/>
+            </w:tcMar>
+            <w:vAlign w:val="center"/>
+          </w:tcPr>
+          <w:p>
+            <w:pPr>
+              <w:spacing w:after="0"/>
+            </w:pPr>
+            <w:r>
+              <w:rPr>
+                <w:b w:val="false"/>
+                <w:bCs w:val="false"/>
+                <w:sz w:val="17"/>
+                <w:szCs w:val="17"/>
+              </w:rPr>
+              <w:t xml:space="preserve">Dos estados das coletas da CGU (ADR-044 e ADR-045); objeto cortado em 160 caracteres</w:t>
+            </w:r>
+          </w:p>
+        </w:tc>
+      </w:tr>
+      <w:tr>
+        <w:trPr>
+          <w:cantSplit/>
+        </w:trPr>
+        <w:tc>
+          <w:tcPr>
+            <w:tcW w:type="dxa" w:w="2400"/>
+            <w:shd w:fill="FFFFFF" w:val="clear"/>
+            <w:tcMar>
+              <w:top w:type="dxa" w:w="70"/>
+              <w:left w:type="dxa" w:w="110"/>
+              <w:bottom w:type="dxa" w:w="70"/>
+              <w:right w:type="dxa" w:w="110"/>
+            </w:tcMar>
+            <w:vAlign w:val="center"/>
+          </w:tcPr>
+          <w:p>
+            <w:pPr>
+              <w:spacing w:after="0"/>
+            </w:pPr>
+            <w:r>
+              <w:rPr>
+                <w:rFonts w:ascii="Consolas" w:cs="Consolas" w:eastAsia="Consolas" w:hAnsi="Consolas"/>
+                <w:b w:val="false"/>
+                <w:bCs w:val="false"/>
+                <w:sz w:val="17"/>
+                <w:szCs w:val="17"/>
+              </w:rPr>
+              <w:t xml:space="preserve">publicar</w:t>
+            </w:r>
+          </w:p>
+        </w:tc>
+        <w:tc>
+          <w:tcPr>
+            <w:tcW w:type="dxa" w:w="3300"/>
+            <w:shd w:fill="FFFFFF" w:val="clear"/>
+            <w:tcMar>
+              <w:top w:type="dxa" w:w="70"/>
+              <w:left w:type="dxa" w:w="110"/>
+              <w:bottom w:type="dxa" w:w="70"/>
+              <w:right w:type="dxa" w:w="110"/>
+            </w:tcMar>
+            <w:vAlign w:val="center"/>
+          </w:tcPr>
+          <w:p>
+            <w:pPr>
+              <w:spacing w:after="0"/>
+            </w:pPr>
+            <w:r>
+              <w:rPr>
+                <w:b w:val="false"/>
+                <w:bCs w:val="false"/>
+                <w:sz w:val="17"/>
+                <w:szCs w:val="17"/>
+              </w:rPr>
+              <w:t xml:space="preserve">pj/&lt;grupo&gt;.json.gz (6º a 8º dígitos do CNPJ)</w:t>
+            </w:r>
+          </w:p>
+        </w:tc>
+        <w:tc>
+          <w:tcPr>
+            <w:tcW w:type="dxa" w:w="3900"/>
+            <w:shd w:fill="FFFFFF" w:val="clear"/>
+            <w:tcMar>
+              <w:top w:type="dxa" w:w="70"/>
+              <w:left w:type="dxa" w:w="110"/>
+              <w:bottom w:type="dxa" w:w="70"/>
+              <w:right w:type="dxa" w:w="110"/>
+            </w:tcMar>
+            <w:vAlign w:val="center"/>
+          </w:tcPr>
+          <w:p>
+            <w:pPr>
+              <w:spacing w:after="0"/>
+            </w:pPr>
+            <w:r>
+              <w:rPr>
+                <w:b w:val="false"/>
+                <w:bCs w:val="false"/>
+                <w:sz w:val="17"/>
+                <w:szCs w:val="17"/>
+              </w:rPr>
+              <w:t xml:space="preserve">Visão 360 da empresa ou entidade (ADR-049); mil arquivos de tamanho parecido</w:t>
+            </w:r>
+          </w:p>
+        </w:tc>
+      </w:tr>
+    </w:tbl>
+    <w:p>
+      <w:pPr>
         <w:pStyle w:val="Heading1"/>
         <w:keepNext/>
         <w:keepLines/>
         <w:spacing w:after="160" w:before="380"/>
       </w:pPr>
-      <w:bookmarkStart w:name="_Toc21" w:id="21"/>
+      <w:bookmarkStart w:name="_Toc22" w:id="22"/>
       <w:r>
         <w:t xml:space="preserve">5. Estado guardado entre execuções</w:t>
       </w:r>
-      <w:bookmarkEnd w:id="21"/>
+      <w:bookmarkEnd w:id="22"/>
     </w:p>
     <w:p>
       <w:pPr>
@@ -11824,11 +12228,11 @@
         <w:keepLines/>
         <w:spacing w:after="160" w:before="380"/>
       </w:pPr>
-      <w:bookmarkStart w:name="_Toc22" w:id="22"/>
+      <w:bookmarkStart w:name="_Toc23" w:id="23"/>
       <w:r>
         <w:t xml:space="preserve">6. Site publicado</w:t>
       </w:r>
-      <w:bookmarkEnd w:id="22"/>
+      <w:bookmarkEnd w:id="23"/>
     </w:p>
     <w:p>
       <w:pPr>
@@ -12896,7 +13300,7 @@
                 <w:sz w:val="17"/>
                 <w:szCs w:val="17"/>
               </w:rPr>
-              <w:t xml:space="preserve">cobertura.json</w:t>
+              <w:t xml:space="preserve">pj/&lt;grupo&gt;.json.gz</w:t>
             </w:r>
           </w:p>
         </w:tc>
@@ -12924,7 +13328,7 @@
                 <w:sz w:val="17"/>
                 <w:szCs w:val="17"/>
               </w:rPr>
-              <w:t xml:space="preserve">cobertura</w:t>
+              <w:t xml:space="preserve">pessoas-juridicas</w:t>
             </w:r>
           </w:p>
         </w:tc>
@@ -12951,7 +13355,7 @@
                 <w:sz w:val="17"/>
                 <w:szCs w:val="17"/>
               </w:rPr>
-              <w:t xml:space="preserve">Por ente: anos com publicação no PNCP, extrato coletado, DCA, RGF, RCL e a marca de até 20 mil habitantes; somas por UF e do Brasil (ADR-048)</w:t>
+              <w:t xml:space="preserve">Por CNPJ: contratos no PNCP por ente e ano, emendas recebidas e convênios com a União (ADR-049). Comprimido</w:t>
             </w:r>
           </w:p>
         </w:tc>
@@ -12984,6 +13388,94 @@
                 <w:sz w:val="17"/>
                 <w:szCs w:val="17"/>
               </w:rPr>
+              <w:t xml:space="preserve">cobertura.json</w:t>
+            </w:r>
+          </w:p>
+        </w:tc>
+        <w:tc>
+          <w:tcPr>
+            <w:tcW w:type="dxa" w:w="2200"/>
+            <w:shd w:fill="F2F2F2" w:val="clear"/>
+            <w:tcMar>
+              <w:top w:type="dxa" w:w="70"/>
+              <w:left w:type="dxa" w:w="110"/>
+              <w:bottom w:type="dxa" w:w="70"/>
+              <w:right w:type="dxa" w:w="110"/>
+            </w:tcMar>
+            <w:vAlign w:val="center"/>
+          </w:tcPr>
+          <w:p>
+            <w:pPr>
+              <w:spacing w:after="0"/>
+            </w:pPr>
+            <w:r>
+              <w:rPr>
+                <w:rFonts w:ascii="Consolas" w:cs="Consolas" w:eastAsia="Consolas" w:hAnsi="Consolas"/>
+                <w:b w:val="false"/>
+                <w:bCs w:val="false"/>
+                <w:sz w:val="17"/>
+                <w:szCs w:val="17"/>
+              </w:rPr>
+              <w:t xml:space="preserve">cobertura</w:t>
+            </w:r>
+          </w:p>
+        </w:tc>
+        <w:tc>
+          <w:tcPr>
+            <w:tcW w:type="dxa" w:w="4200"/>
+            <w:shd w:fill="F2F2F2" w:val="clear"/>
+            <w:tcMar>
+              <w:top w:type="dxa" w:w="70"/>
+              <w:left w:type="dxa" w:w="110"/>
+              <w:bottom w:type="dxa" w:w="70"/>
+              <w:right w:type="dxa" w:w="110"/>
+            </w:tcMar>
+            <w:vAlign w:val="center"/>
+          </w:tcPr>
+          <w:p>
+            <w:pPr>
+              <w:spacing w:after="0"/>
+            </w:pPr>
+            <w:r>
+              <w:rPr>
+                <w:b w:val="false"/>
+                <w:bCs w:val="false"/>
+                <w:sz w:val="17"/>
+                <w:szCs w:val="17"/>
+              </w:rPr>
+              <w:t xml:space="preserve">Por ente: anos com publicação no PNCP, extrato coletado, DCA, RGF, RCL e a marca de até 20 mil habitantes; somas por UF e do Brasil (ADR-048)</w:t>
+            </w:r>
+          </w:p>
+        </w:tc>
+      </w:tr>
+      <w:tr>
+        <w:trPr>
+          <w:cantSplit/>
+        </w:trPr>
+        <w:tc>
+          <w:tcPr>
+            <w:tcW w:type="dxa" w:w="3200"/>
+            <w:shd w:fill="FFFFFF" w:val="clear"/>
+            <w:tcMar>
+              <w:top w:type="dxa" w:w="70"/>
+              <w:left w:type="dxa" w:w="110"/>
+              <w:bottom w:type="dxa" w:w="70"/>
+              <w:right w:type="dxa" w:w="110"/>
+            </w:tcMar>
+            <w:vAlign w:val="center"/>
+          </w:tcPr>
+          <w:p>
+            <w:pPr>
+              <w:spacing w:after="0"/>
+            </w:pPr>
+            <w:r>
+              <w:rPr>
+                <w:rFonts w:ascii="Consolas" w:cs="Consolas" w:eastAsia="Consolas" w:hAnsi="Consolas"/>
+                <w:b w:val="false"/>
+                <w:bCs w:val="false"/>
+                <w:sz w:val="17"/>
+                <w:szCs w:val="17"/>
+              </w:rPr>
               <w:t xml:space="preserve">conformidade/pares/&lt;id&gt;.json</w:t>
             </w:r>
           </w:p>
@@ -12991,7 +13483,7 @@
         <w:tc>
           <w:tcPr>
             <w:tcW w:type="dxa" w:w="2200"/>
-            <w:shd w:fill="F2F2F2" w:val="clear"/>
+            <w:shd w:fill="FFFFFF" w:val="clear"/>
             <w:tcMar>
               <w:top w:type="dxa" w:w="70"/>
               <w:left w:type="dxa" w:w="110"/>
@@ -13019,7 +13511,7 @@
         <w:tc>
           <w:tcPr>
             <w:tcW w:type="dxa" w:w="4200"/>
-            <w:shd w:fill="F2F2F2" w:val="clear"/>
+            <w:shd w:fill="FFFFFF" w:val="clear"/>
             <w:tcMar>
               <w:top w:type="dxa" w:w="70"/>
               <w:left w:type="dxa" w:w="110"/>
@@ -13052,11 +13544,11 @@
         <w:keepLines/>
         <w:spacing w:after="160" w:before="380"/>
       </w:pPr>
-      <w:bookmarkStart w:name="_Toc23" w:id="23"/>
+      <w:bookmarkStart w:name="_Toc24" w:id="24"/>
       <w:r>
         <w:t xml:space="preserve">7. Regras de soma das contratações</w:t>
       </w:r>
-      <w:bookmarkEnd w:id="23"/>
+      <w:bookmarkEnd w:id="24"/>
     </w:p>
     <w:p>
       <w:pPr>
@@ -13218,11 +13710,11 @@
         <w:keepLines/>
         <w:spacing w:after="160" w:before="380"/>
       </w:pPr>
-      <w:bookmarkStart w:name="_Toc24" w:id="24"/>
+      <w:bookmarkStart w:name="_Toc25" w:id="25"/>
       <w:r>
         <w:t xml:space="preserve">8. Avaliação da conformidade</w:t>
       </w:r>
-      <w:bookmarkEnd w:id="24"/>
+      <w:bookmarkEnd w:id="25"/>
     </w:p>
     <w:tbl>
       <w:tblPr>
@@ -14455,11 +14947,11 @@
         <w:keepLines/>
         <w:spacing w:after="120" w:before="280"/>
       </w:pPr>
-      <w:bookmarkStart w:name="_Toc25" w:id="25"/>
+      <w:bookmarkStart w:name="_Toc26" w:id="26"/>
       <w:r>
         <w:t xml:space="preserve">8.1 Comparação com o grupo de pares (ADR-038)</w:t>
       </w:r>
-      <w:bookmarkEnd w:id="25"/>
+      <w:bookmarkEnd w:id="26"/>
     </w:p>
     <w:p>
       <w:pPr>
@@ -14492,11 +14984,11 @@
         <w:keepLines/>
         <w:spacing w:after="160" w:before="380"/>
       </w:pPr>
-      <w:bookmarkStart w:name="_Toc26" w:id="26"/>
+      <w:bookmarkStart w:name="_Toc27" w:id="27"/>
       <w:r>
         <w:t xml:space="preserve">9. Portal</w:t>
       </w:r>
-      <w:bookmarkEnd w:id="26"/>
+      <w:bookmarkEnd w:id="27"/>
     </w:p>
     <w:tbl>
       <w:tblPr>
@@ -15547,11 +16039,11 @@
         <w:keepLines/>
         <w:spacing w:after="160" w:before="380"/>
       </w:pPr>
-      <w:bookmarkStart w:name="_Toc27" w:id="27"/>
+      <w:bookmarkStart w:name="_Toc28" w:id="28"/>
       <w:r>
         <w:t xml:space="preserve">10. Operação</w:t>
       </w:r>
-      <w:bookmarkEnd w:id="27"/>
+      <w:bookmarkEnd w:id="28"/>
     </w:p>
     <w:tbl>
       <w:tblPr>
@@ -15928,11 +16420,11 @@
         <w:keepLines/>
         <w:spacing w:after="100" w:before="220"/>
       </w:pPr>
-      <w:bookmarkStart w:name="_Toc28" w:id="28"/>
+      <w:bookmarkStart w:name="_Toc29" w:id="29"/>
       <w:r>
         <w:t xml:space="preserve">Configuração, uma vez</w:t>
       </w:r>
-      <w:bookmarkEnd w:id="28"/>
+      <w:bookmarkEnd w:id="29"/>
     </w:p>
     <w:p>
       <w:pPr>
@@ -16023,11 +16515,11 @@
         <w:keepLines/>
         <w:spacing w:after="100" w:before="220"/>
       </w:pPr>
-      <w:bookmarkStart w:name="_Toc29" w:id="29"/>
+      <w:bookmarkStart w:name="_Toc30" w:id="30"/>
       <w:r>
         <w:t xml:space="preserve">Comandos locais</w:t>
       </w:r>
-      <w:bookmarkEnd w:id="29"/>
+      <w:bookmarkEnd w:id="30"/>
     </w:p>
     <w:tbl>
       <w:tblPr>
@@ -16250,11 +16742,11 @@
         <w:keepLines/>
         <w:spacing w:after="100" w:before="220"/>
       </w:pPr>
-      <w:bookmarkStart w:name="_Toc30" w:id="30"/>
+      <w:bookmarkStart w:name="_Toc31" w:id="31"/>
       <w:r>
         <w:t xml:space="preserve">Limites</w:t>
       </w:r>
-      <w:bookmarkEnd w:id="30"/>
+      <w:bookmarkEnd w:id="31"/>
     </w:p>
     <w:p>
       <w:pPr>
@@ -16302,11 +16794,11 @@
         <w:keepLines/>
         <w:spacing w:after="160" w:before="380"/>
       </w:pPr>
-      <w:bookmarkStart w:name="_Toc31" w:id="31"/>
+      <w:bookmarkStart w:name="_Toc32" w:id="32"/>
       <w:r>
         <w:t xml:space="preserve">11. Verificação</w:t>
       </w:r>
-      <w:bookmarkEnd w:id="31"/>
+      <w:bookmarkEnd w:id="32"/>
     </w:p>
     <w:tbl>
       <w:tblPr>
@@ -16607,11 +17099,11 @@
         <w:keepLines/>
         <w:spacing w:after="160" w:before="380"/>
       </w:pPr>
-      <w:bookmarkStart w:name="_Toc32" w:id="32"/>
+      <w:bookmarkStart w:name="_Toc33" w:id="33"/>
       <w:r>
         <w:t xml:space="preserve">12. Próximos passos e riscos</w:t>
       </w:r>
-      <w:bookmarkEnd w:id="32"/>
+      <w:bookmarkEnd w:id="33"/>
     </w:p>
     <w:tbl>
       <w:tblPr>

</xml_diff>

<commit_message>
Cobertura: o publicado no PNCP sem ente identificado, com a fração e os órgãos (ADR-048)
</commit_message>
<xml_diff>
--- a/docs/DOC-13_Paineis.docx
+++ b/docs/DOC-13_Paineis.docx
@@ -10843,6 +10843,93 @@
                 <w:szCs w:val="17"/>
               </w:rPr>
               <w:t xml:space="preserve">Critério de saída da Fase 1 (ADR-048); mede o que o Lumen tem, não avalia o ente</w:t>
+            </w:r>
+          </w:p>
+        </w:tc>
+      </w:tr>
+      <w:tr>
+        <w:trPr>
+          <w:cantSplit/>
+        </w:trPr>
+        <w:tc>
+          <w:tcPr>
+            <w:tcW w:type="dxa" w:w="2400"/>
+            <w:shd w:fill="F2F2F2" w:val="clear"/>
+            <w:tcMar>
+              <w:top w:type="dxa" w:w="70"/>
+              <w:left w:type="dxa" w:w="110"/>
+              <w:bottom w:type="dxa" w:w="70"/>
+              <w:right w:type="dxa" w:w="110"/>
+            </w:tcMar>
+            <w:vAlign w:val="center"/>
+          </w:tcPr>
+          <w:p>
+            <w:pPr>
+              <w:spacing w:after="0"/>
+            </w:pPr>
+            <w:r>
+              <w:rPr>
+                <w:rFonts w:ascii="Consolas" w:cs="Consolas" w:eastAsia="Consolas" w:hAnsi="Consolas"/>
+                <w:b w:val="false"/>
+                <w:bCs w:val="false"/>
+                <w:sz w:val="17"/>
+                <w:szCs w:val="17"/>
+              </w:rPr>
+              <w:t xml:space="preserve">sem_ente</w:t>
+            </w:r>
+          </w:p>
+        </w:tc>
+        <w:tc>
+          <w:tcPr>
+            <w:tcW w:type="dxa" w:w="3300"/>
+            <w:shd w:fill="F2F2F2" w:val="clear"/>
+            <w:tcMar>
+              <w:top w:type="dxa" w:w="70"/>
+              <w:left w:type="dxa" w:w="110"/>
+              <w:bottom w:type="dxa" w:w="70"/>
+              <w:right w:type="dxa" w:w="110"/>
+            </w:tcMar>
+            <w:vAlign w:val="center"/>
+          </w:tcPr>
+          <w:p>
+            <w:pPr>
+              <w:spacing w:after="0"/>
+            </w:pPr>
+            <w:r>
+              <w:rPr>
+                <w:b w:val="false"/>
+                <w:bCs w:val="false"/>
+                <w:sz w:val="17"/>
+                <w:szCs w:val="17"/>
+              </w:rPr>
+              <w:t xml:space="preserve">O publicado sem ente: totais, fração dos processos e do valor e os 20 órgãos sem ente com mais processos</w:t>
+            </w:r>
+          </w:p>
+        </w:tc>
+        <w:tc>
+          <w:tcPr>
+            <w:tcW w:type="dxa" w:w="3900"/>
+            <w:shd w:fill="F2F2F2" w:val="clear"/>
+            <w:tcMar>
+              <w:top w:type="dxa" w:w="70"/>
+              <w:left w:type="dxa" w:w="110"/>
+              <w:bottom w:type="dxa" w:w="70"/>
+              <w:right w:type="dxa" w:w="110"/>
+            </w:tcMar>
+            <w:vAlign w:val="center"/>
+          </w:tcPr>
+          <w:p>
+            <w:pPr>
+              <w:spacing w:after="0"/>
+            </w:pPr>
+            <w:r>
+              <w:rPr>
+                <w:b w:val="false"/>
+                <w:bCs w:val="false"/>
+                <w:sz w:val="17"/>
+                <w:szCs w:val="17"/>
+              </w:rPr>
+              <w:t xml:space="preserve">Fica no panorama do Brasil e fora das linhas; em 2026, 13,9% do valor estimado</w:t>
             </w:r>
           </w:p>
         </w:tc>

</xml_diff>

<commit_message>
Contratações: estatais federais publicadas sem esfera entram na União, pelo cadastro da SEST (ADR-048)
</commit_message>
<xml_diff>
--- a/docs/DOC-13_Paineis.docx
+++ b/docs/DOC-13_Paineis.docx
@@ -4650,7 +4650,7 @@
                 <w:sz w:val="17"/>
                 <w:szCs w:val="17"/>
               </w:rPr>
-              <w:t xml:space="preserve">Linha sem ente reconhecido vai só para o Brasil e para sem_ente</w:t>
+              <w:t xml:space="preserve">Linha sem ente reconhecido vai só para o Brasil e para sem_ente; antes, o órgão sem ente da lista de vínculos ganha o ente</w:t>
             </w:r>
           </w:p>
         </w:tc>
@@ -4683,7 +4683,7 @@
                 <w:sz w:val="17"/>
                 <w:szCs w:val="17"/>
               </w:rPr>
-              <w:t xml:space="preserve">ente_para_json</w:t>
+              <w:t xml:space="preserve">estatais_federais</w:t>
             </w:r>
           </w:p>
         </w:tc>
@@ -4710,7 +4710,7 @@
                 <w:sz w:val="17"/>
                 <w:szCs w:val="17"/>
               </w:rPr>
-              <w:t xml:space="preserve">Arquivo de um ente; o de um estado traz os municípios da UF</w:t>
+              <w:t xml:space="preserve">As estatais federais do cadastro da SEST pela raiz do CNPJ, ligadas à União</w:t>
             </w:r>
           </w:p>
         </w:tc>
@@ -4737,7 +4737,7 @@
                 <w:sz w:val="17"/>
                 <w:szCs w:val="17"/>
               </w:rPr>
-              <w:t xml:space="preserve">Municípios do cadastro e os que publicaram, por nome, com zero quando não publicaram</w:t>
+              <w:t xml:space="preserve">O PNCP publica algumas sem esfera (Caixa, EBSERH, BNDES); ADR-048</w:t>
             </w:r>
           </w:p>
         </w:tc>
@@ -4770,7 +4770,7 @@
                 <w:sz w:val="17"/>
                 <w:szCs w:val="17"/>
               </w:rPr>
-              <w:t xml:space="preserve">orgao_para_json</w:t>
+              <w:t xml:space="preserve">ente_para_json</w:t>
             </w:r>
           </w:p>
         </w:tc>
@@ -4797,7 +4797,7 @@
                 <w:sz w:val="17"/>
                 <w:szCs w:val="17"/>
               </w:rPr>
-              <w:t xml:space="preserve">Arquivo de um órgão, com o ente a que pertence</w:t>
+              <w:t xml:space="preserve">Arquivo de um ente; o de um estado traz os municípios da UF</w:t>
             </w:r>
           </w:p>
         </w:tc>
@@ -4824,7 +4824,7 @@
                 <w:sz w:val="17"/>
                 <w:szCs w:val="17"/>
               </w:rPr>
-              <w:t xml:space="preserve">Para quem procura uma entidade: um serviço autônomo de água e esgoto, uma fundação, uma empresa pública</w:t>
+              <w:t xml:space="preserve">Municípios do cadastro e os que publicaram, por nome, com zero quando não publicaram</w:t>
             </w:r>
           </w:p>
         </w:tc>
@@ -4857,7 +4857,7 @@
                 <w:sz w:val="17"/>
                 <w:szCs w:val="17"/>
               </w:rPr>
-              <w:t xml:space="preserve">teto_do_ente</w:t>
+              <w:t xml:space="preserve">orgao_para_json</w:t>
             </w:r>
           </w:p>
         </w:tc>
@@ -4884,7 +4884,7 @@
                 <w:sz w:val="17"/>
                 <w:szCs w:val="17"/>
               </w:rPr>
-              <w:t xml:space="preserve">Teto de plausibilidade de um processo ou contrato: R$ 10 bilhões ou R$ 20 mil por habitante do ente, o menor</w:t>
+              <w:t xml:space="preserve">Arquivo de um órgão, com o ente a que pertence</w:t>
             </w:r>
           </w:p>
         </w:tc>
@@ -4911,7 +4911,7 @@
                 <w:sz w:val="17"/>
                 <w:szCs w:val="17"/>
               </w:rPr>
-              <w:t xml:space="preserve">Acima dele, conta na quantidade e fica fora das somas, em "valores a conferir"</w:t>
+              <w:t xml:space="preserve">Para quem procura uma entidade: um serviço autônomo de água e esgoto, uma fundação, uma empresa pública</w:t>
             </w:r>
           </w:p>
         </w:tc>
@@ -4944,7 +4944,7 @@
                 <w:sz w:val="17"/>
                 <w:szCs w:val="17"/>
               </w:rPr>
-              <w:t xml:space="preserve">orgaos_para_busca</w:t>
+              <w:t xml:space="preserve">teto_do_ente</w:t>
             </w:r>
           </w:p>
         </w:tc>
@@ -4971,7 +4971,7 @@
                 <w:sz w:val="17"/>
                 <w:szCs w:val="17"/>
               </w:rPr>
-              <w:t xml:space="preserve">Todo órgão com publicação no período: CNPJ, razão social, ente, esfera, processos e contratos</w:t>
+              <w:t xml:space="preserve">Teto de plausibilidade de um processo ou contrato: R$ 10 bilhões ou R$ 20 mil por habitante do ente, o menor</w:t>
             </w:r>
           </w:p>
         </w:tc>
@@ -4998,7 +4998,7 @@
                 <w:sz w:val="17"/>
                 <w:szCs w:val="17"/>
               </w:rPr>
-              <w:t xml:space="preserve">Para a busca do portal achar uma entidade pelo nome, pela sigla ou pelo CNPJ</w:t>
+              <w:t xml:space="preserve">Acima dele, conta na quantidade e fica fora das somas, em "valores a conferir"</w:t>
             </w:r>
           </w:p>
         </w:tc>
@@ -5031,7 +5031,7 @@
                 <w:sz w:val="17"/>
                 <w:szCs w:val="17"/>
               </w:rPr>
-              <w:t xml:space="preserve">panorama_para_json</w:t>
+              <w:t xml:space="preserve">orgaos_para_busca</w:t>
             </w:r>
           </w:p>
         </w:tc>
@@ -5058,7 +5058,7 @@
                 <w:sz w:val="17"/>
                 <w:szCs w:val="17"/>
               </w:rPr>
-              <w:t xml:space="preserve">Brasil: esferas, UFs (governo do estado e municípios), meses, modalidades, 30 maiores fornecedores</w:t>
+              <w:t xml:space="preserve">Todo órgão com publicação no período: CNPJ, razão social, ente, esfera, processos e contratos</w:t>
             </w:r>
           </w:p>
         </w:tc>
@@ -5085,7 +5085,7 @@
                 <w:sz w:val="17"/>
                 <w:szCs w:val="17"/>
               </w:rPr>
-              <w:t xml:space="preserve">UFs em ordem alfabética; nada ordenado por risco</w:t>
+              <w:t xml:space="preserve">Para a busca do portal achar uma entidade pelo nome, pela sigla ou pelo CNPJ</w:t>
             </w:r>
           </w:p>
         </w:tc>
@@ -5118,6 +5118,93 @@
                 <w:sz w:val="17"/>
                 <w:szCs w:val="17"/>
               </w:rPr>
+              <w:t xml:space="preserve">panorama_para_json</w:t>
+            </w:r>
+          </w:p>
+        </w:tc>
+        <w:tc>
+          <w:tcPr>
+            <w:tcW w:type="dxa" w:w="3300"/>
+            <w:shd w:fill="FFFFFF" w:val="clear"/>
+            <w:tcMar>
+              <w:top w:type="dxa" w:w="70"/>
+              <w:left w:type="dxa" w:w="110"/>
+              <w:bottom w:type="dxa" w:w="70"/>
+              <w:right w:type="dxa" w:w="110"/>
+            </w:tcMar>
+            <w:vAlign w:val="center"/>
+          </w:tcPr>
+          <w:p>
+            <w:pPr>
+              <w:spacing w:after="0"/>
+            </w:pPr>
+            <w:r>
+              <w:rPr>
+                <w:b w:val="false"/>
+                <w:bCs w:val="false"/>
+                <w:sz w:val="17"/>
+                <w:szCs w:val="17"/>
+              </w:rPr>
+              <w:t xml:space="preserve">Brasil: esferas, UFs (governo do estado e municípios), meses, modalidades, 30 maiores fornecedores</w:t>
+            </w:r>
+          </w:p>
+        </w:tc>
+        <w:tc>
+          <w:tcPr>
+            <w:tcW w:type="dxa" w:w="3900"/>
+            <w:shd w:fill="FFFFFF" w:val="clear"/>
+            <w:tcMar>
+              <w:top w:type="dxa" w:w="70"/>
+              <w:left w:type="dxa" w:w="110"/>
+              <w:bottom w:type="dxa" w:w="70"/>
+              <w:right w:type="dxa" w:w="110"/>
+            </w:tcMar>
+            <w:vAlign w:val="center"/>
+          </w:tcPr>
+          <w:p>
+            <w:pPr>
+              <w:spacing w:after="0"/>
+            </w:pPr>
+            <w:r>
+              <w:rPr>
+                <w:b w:val="false"/>
+                <w:bCs w:val="false"/>
+                <w:sz w:val="17"/>
+                <w:szCs w:val="17"/>
+              </w:rPr>
+              <w:t xml:space="preserve">UFs em ordem alfabética; nada ordenado por risco</w:t>
+            </w:r>
+          </w:p>
+        </w:tc>
+      </w:tr>
+      <w:tr>
+        <w:trPr>
+          <w:cantSplit/>
+        </w:trPr>
+        <w:tc>
+          <w:tcPr>
+            <w:tcW w:type="dxa" w:w="2400"/>
+            <w:shd w:fill="F2F2F2" w:val="clear"/>
+            <w:tcMar>
+              <w:top w:type="dxa" w:w="70"/>
+              <w:left w:type="dxa" w:w="110"/>
+              <w:bottom w:type="dxa" w:w="70"/>
+              <w:right w:type="dxa" w:w="110"/>
+            </w:tcMar>
+            <w:vAlign w:val="center"/>
+          </w:tcPr>
+          <w:p>
+            <w:pPr>
+              <w:spacing w:after="0"/>
+            </w:pPr>
+            <w:r>
+              <w:rPr>
+                <w:rFonts w:ascii="Consolas" w:cs="Consolas" w:eastAsia="Consolas" w:hAnsi="Consolas"/>
+                <w:b w:val="false"/>
+                <w:bCs w:val="false"/>
+                <w:sz w:val="17"/>
+                <w:szCs w:val="17"/>
+              </w:rPr>
               <w:t xml:space="preserve">Painel.cobertura</w:t>
             </w:r>
           </w:p>
@@ -5125,7 +5212,7 @@
         <w:tc>
           <w:tcPr>
             <w:tcW w:type="dxa" w:w="3300"/>
-            <w:shd w:fill="FFFFFF" w:val="clear"/>
+            <w:shd w:fill="F2F2F2" w:val="clear"/>
             <w:tcMar>
               <w:top w:type="dxa" w:w="70"/>
               <w:left w:type="dxa" w:w="110"/>
@@ -5152,7 +5239,7 @@
         <w:tc>
           <w:tcPr>
             <w:tcW w:type="dxa" w:w="3900"/>
-            <w:shd w:fill="FFFFFF" w:val="clear"/>
+            <w:shd w:fill="F2F2F2" w:val="clear"/>
             <w:tcMar>
               <w:top w:type="dxa" w:w="70"/>
               <w:left w:type="dxa" w:w="110"/>
@@ -10929,7 +11016,7 @@
                 <w:sz w:val="17"/>
                 <w:szCs w:val="17"/>
               </w:rPr>
-              <w:t xml:space="preserve">Fica no panorama do Brasil e fora das linhas; em 2026, 13,9% do valor estimado</w:t>
+              <w:t xml:space="preserve">Fica no panorama do Brasil e fora das linhas; em 2026, 9,8% do valor estimado, depois das estatais federais</w:t>
             </w:r>
           </w:p>
         </w:tc>

</xml_diff>

<commit_message>
Empresa ou entidade: busca pelo nome, por prefixo de palavra (ADR-049)
</commit_message>
<xml_diff>
--- a/docs/DOC-13_Paineis.docx
+++ b/docs/DOC-13_Paineis.docx
@@ -11398,6 +11398,93 @@
                 <w:szCs w:val="17"/>
               </w:rPr>
               <w:t xml:space="preserve">Visão 360 da empresa ou entidade (ADR-049); mil arquivos de tamanho parecido</w:t>
+            </w:r>
+          </w:p>
+        </w:tc>
+      </w:tr>
+      <w:tr>
+        <w:trPr>
+          <w:cantSplit/>
+        </w:trPr>
+        <w:tc>
+          <w:tcPr>
+            <w:tcW w:type="dxa" w:w="2400"/>
+            <w:shd w:fill="F2F2F2" w:val="clear"/>
+            <w:tcMar>
+              <w:top w:type="dxa" w:w="70"/>
+              <w:left w:type="dxa" w:w="110"/>
+              <w:bottom w:type="dxa" w:w="70"/>
+              <w:right w:type="dxa" w:w="110"/>
+            </w:tcMar>
+            <w:vAlign w:val="center"/>
+          </w:tcPr>
+          <w:p>
+            <w:pPr>
+              <w:spacing w:after="0"/>
+            </w:pPr>
+            <w:r>
+              <w:rPr>
+                <w:rFonts w:ascii="Consolas" w:cs="Consolas" w:eastAsia="Consolas" w:hAnsi="Consolas"/>
+                <w:b w:val="false"/>
+                <w:bCs w:val="false"/>
+                <w:sz w:val="17"/>
+                <w:szCs w:val="17"/>
+              </w:rPr>
+              <w:t xml:space="preserve">normalizar, palavras_da_busca, montar_busca</w:t>
+            </w:r>
+          </w:p>
+        </w:tc>
+        <w:tc>
+          <w:tcPr>
+            <w:tcW w:type="dxa" w:w="3300"/>
+            <w:shd w:fill="F2F2F2" w:val="clear"/>
+            <w:tcMar>
+              <w:top w:type="dxa" w:w="70"/>
+              <w:left w:type="dxa" w:w="110"/>
+              <w:bottom w:type="dxa" w:w="70"/>
+              <w:right w:type="dxa" w:w="110"/>
+            </w:tcMar>
+            <w:vAlign w:val="center"/>
+          </w:tcPr>
+          <w:p>
+            <w:pPr>
+              <w:spacing w:after="0"/>
+            </w:pPr>
+            <w:r>
+              <w:rPr>
+                <w:b w:val="false"/>
+                <w:bCs w:val="false"/>
+                <w:sz w:val="17"/>
+                <w:szCs w:val="17"/>
+              </w:rPr>
+              <w:t xml:space="preserve">A busca pelo nome: pj/busca/&lt;prefixo&gt;.json.gz e o índice</w:t>
+            </w:r>
+          </w:p>
+        </w:tc>
+        <w:tc>
+          <w:tcPr>
+            <w:tcW w:type="dxa" w:w="3900"/>
+            <w:shd w:fill="F2F2F2" w:val="clear"/>
+            <w:tcMar>
+              <w:top w:type="dxa" w:w="70"/>
+              <w:left w:type="dxa" w:w="110"/>
+              <w:bottom w:type="dxa" w:w="70"/>
+              <w:right w:type="dxa" w:w="110"/>
+            </w:tcMar>
+            <w:vAlign w:val="center"/>
+          </w:tcPr>
+          <w:p>
+            <w:pPr>
+              <w:spacing w:after="0"/>
+            </w:pPr>
+            <w:r>
+              <w:rPr>
+                <w:b w:val="false"/>
+                <w:bCs w:val="false"/>
+                <w:sz w:val="17"/>
+                <w:szCs w:val="17"/>
+              </w:rPr>
+              <w:t xml:space="preserve">Prefixo de duas letras de cada palavra (três quando passa de 10 mil nomes); normalização igual à do portal</w:t>
             </w:r>
           </w:p>
         </w:tc>

</xml_diff>

<commit_message>
Tribunais de contas: o TCE-PR e o módulo comum (ADR-050, adendo)
- lumen painel tce-pr: os contratos dos 399 municípios paranaenses no SIM-AM, de 2013
  em diante, município a município (uns 80 s por ano); o ZIP do estado só sinaliza
  mudança. Soma a parte de cada contratado; consórcio sem ente; pessoa física só na
  soma (o tribunal publica o nome, o Lumen não guarda); supressão negativa nos aditivos.
- tce.py: o comum aos tribunais (leitura por partes, quando reler, soma do ano e a
  publicação que junta os tribunais em tce/ente/<grupo>.json.gz); o índice por CNPJ lê
  todos os estados tce-*.json.gz.
- O fluxo tce roda um job por tribunal.
</commit_message>
<xml_diff>
--- a/docs/DOC-13_Paineis.docx
+++ b/docs/DOC-13_Paineis.docx
@@ -923,7 +923,7 @@
           </w:pPr>
           <w:hyperlink w:history="1" w:anchor="_Toc21">
             <w:r>
-              <w:t xml:space="preserve">4.16 tce_rs.py</w:t>
+              <w:t xml:space="preserve">4.16 tce.py, tce_rs.py e tce_pr.py</w:t>
             </w:r>
             <w:r>
               <w:tab/>
@@ -11054,7 +11054,7 @@
       </w:pPr>
       <w:bookmarkStart w:name="_Toc21" w:id="21"/>
       <w:r>
-        <w:t xml:space="preserve">4.16 tce_rs.py</w:t>
+        <w:t xml:space="preserve">4.16 tce.py, tce_rs.py e tce_pr.py</w:t>
       </w:r>
       <w:bookmarkEnd w:id="21"/>
     </w:p>
@@ -11192,7 +11192,7 @@
                 <w:sz w:val="17"/>
                 <w:szCs w:val="17"/>
               </w:rPr>
-              <w:t xml:space="preserve">cabecalho, ArquivoRemoto</w:t>
+              <w:t xml:space="preserve">tce.cabecalho, tce.ArquivoRemoto</w:t>
             </w:r>
           </w:p>
         </w:tc>
@@ -11219,7 +11219,7 @@
                 <w:sz w:val="17"/>
                 <w:szCs w:val="17"/>
               </w:rPr>
-              <w:t xml:space="preserve">O tamanho e a etiqueta de cada ZIP e a leitura por partes (Range)</w:t>
+              <w:t xml:space="preserve">O tamanho e a etiqueta de cada arquivo e a leitura por partes (Range)</w:t>
             </w:r>
           </w:p>
         </w:tc>
@@ -11246,7 +11246,7 @@
                 <w:sz w:val="17"/>
                 <w:szCs w:val="17"/>
               </w:rPr>
-              <w:t xml:space="preserve">Cada ZIP anual repete a tabela de pessoas (80 MB); lendo por partes, cada ano custa uns 5 MB</w:t>
+              <w:t xml:space="preserve">Cada ZIP anual do TCE-RS repete a tabela de pessoas (80 MB); lendo por partes, cada ano custa uns 5 MB</w:t>
             </w:r>
           </w:p>
         </w:tc>
@@ -11279,7 +11279,7 @@
                 <w:sz w:val="17"/>
                 <w:szCs w:val="17"/>
               </w:rPr>
-              <w:t xml:space="preserve">ler_orgaos</w:t>
+              <w:t xml:space="preserve">tce.SomaAno</w:t>
             </w:r>
           </w:p>
         </w:tc>
@@ -11306,7 +11306,7 @@
                 <w:sz w:val="17"/>
                 <w:szCs w:val="17"/>
               </w:rPr>
-              <w:t xml:space="preserve">Os órgãos auditados no ente: municipais no município, estaduais no estado</w:t>
+              <w:t xml:space="preserve">A soma de um ano por ente (contratos, valor, fora do teto, pessoa física, aditivos) e por CNPJ</w:t>
             </w:r>
           </w:p>
         </w:tc>
@@ -11333,7 +11333,7 @@
                 <w:sz w:val="17"/>
                 <w:szCs w:val="17"/>
               </w:rPr>
-              <w:t xml:space="preserve">Consórcios administrativos e associações ficam sem ente, como no PNCP</w:t>
+              <w:t xml:space="preserve">Mesmo teto de plausibilidade do PNCP; o CPF nunca é guardado</w:t>
             </w:r>
           </w:p>
         </w:tc>
@@ -11366,7 +11366,7 @@
                 <w:sz w:val="17"/>
                 <w:szCs w:val="17"/>
               </w:rPr>
-              <w:t xml:space="preserve">ler_ano, ler_nomes</w:t>
+              <w:t xml:space="preserve">tce.precisa_ler</w:t>
             </w:r>
           </w:p>
         </w:tc>
@@ -11393,7 +11393,7 @@
                 <w:sz w:val="17"/>
                 <w:szCs w:val="17"/>
               </w:rPr>
-              <w:t xml:space="preserve">Os contratos de um ano por ente (contratos, valor, fora do teto, pessoa física, aditivos) e por CNPJ; os nomes das empresas</w:t>
+              <w:t xml:space="preserve">Se o ano tem de ser lido de novo</w:t>
             </w:r>
           </w:p>
         </w:tc>
@@ -11420,7 +11420,7 @@
                 <w:sz w:val="17"/>
                 <w:szCs w:val="17"/>
               </w:rPr>
-              <w:t xml:space="preserve">Mesmo teto de plausibilidade do PNCP; o CPF nunca é guardado; o nome do MEI sai mascarado</w:t>
+              <w:t xml:space="preserve">Ano fechado só quando muda de tamanho; o corrente e o anterior, uma vez por semana</w:t>
             </w:r>
           </w:p>
         </w:tc>
@@ -11453,7 +11453,7 @@
                 <w:sz w:val="17"/>
                 <w:szCs w:val="17"/>
               </w:rPr>
-              <w:t xml:space="preserve">precisa_ler, coletar (lumen painel tce-rs)</w:t>
+              <w:t xml:space="preserve">tce.publicar</w:t>
             </w:r>
           </w:p>
         </w:tc>
@@ -11480,7 +11480,7 @@
                 <w:sz w:val="17"/>
                 <w:szCs w:val="17"/>
               </w:rPr>
-              <w:t xml:space="preserve">Lê só os anos que mudaram e grava tce-rs.json.gz depois de cada um</w:t>
+              <w:t xml:space="preserve">tce/ente/&lt;grupo&gt;.json.gz: por ente, o tribunal, os anos e os 100 maiores fornecedores</w:t>
             </w:r>
           </w:p>
         </w:tc>
@@ -11507,7 +11507,7 @@
                 <w:sz w:val="17"/>
                 <w:szCs w:val="17"/>
               </w:rPr>
-              <w:t xml:space="preserve">Ano fechado só quando muda de tamanho; o corrente e o anterior, uma vez por semana</w:t>
+              <w:t xml:space="preserve">Junta os tribunais; lido no mandato aberto de Governos municipais; não se soma ao PNCP (ADR-050)</w:t>
             </w:r>
           </w:p>
         </w:tc>
@@ -11540,7 +11540,7 @@
                 <w:sz w:val="17"/>
                 <w:szCs w:val="17"/>
               </w:rPr>
-              <w:t xml:space="preserve">publicar</w:t>
+              <w:t xml:space="preserve">tce_rs.ler_orgaos, ler_ano, ler_nomes, coletar</w:t>
             </w:r>
           </w:p>
         </w:tc>
@@ -11567,7 +11567,7 @@
                 <w:sz w:val="17"/>
                 <w:szCs w:val="17"/>
               </w:rPr>
-              <w:t xml:space="preserve">tce/ente/&lt;grupo&gt;.json.gz: por ente, os anos e os 100 maiores fornecedores</w:t>
+              <w:t xml:space="preserve">LicitaCon: órgão no ente, contratos e aditivos do ano, nomes das empresas</w:t>
             </w:r>
           </w:p>
         </w:tc>
@@ -11594,7 +11594,94 @@
                 <w:sz w:val="17"/>
                 <w:szCs w:val="17"/>
               </w:rPr>
-              <w:t xml:space="preserve">Lido no mandato aberto de Governos municipais; não se soma ao PNCP (ADR-050)</w:t>
+              <w:t xml:space="preserve">Consórcios e associações sem ente; o nome do MEI sai mascarado</w:t>
+            </w:r>
+          </w:p>
+        </w:tc>
+      </w:tr>
+      <w:tr>
+        <w:trPr>
+          <w:cantSplit/>
+        </w:trPr>
+        <w:tc>
+          <w:tcPr>
+            <w:tcW w:type="dxa" w:w="2400"/>
+            <w:shd w:fill="F2F2F2" w:val="clear"/>
+            <w:tcMar>
+              <w:top w:type="dxa" w:w="70"/>
+              <w:left w:type="dxa" w:w="110"/>
+              <w:bottom w:type="dxa" w:w="70"/>
+              <w:right w:type="dxa" w:w="110"/>
+            </w:tcMar>
+            <w:vAlign w:val="center"/>
+          </w:tcPr>
+          <w:p>
+            <w:pPr>
+              <w:spacing w:after="0"/>
+            </w:pPr>
+            <w:r>
+              <w:rPr>
+                <w:rFonts w:ascii="Consolas" w:cs="Consolas" w:eastAsia="Consolas" w:hAnsi="Consolas"/>
+                <w:b w:val="false"/>
+                <w:bCs w:val="false"/>
+                <w:sz w:val="17"/>
+                <w:szCs w:val="17"/>
+              </w:rPr>
+              <w:t xml:space="preserve">tce_pr.ler_municipio, coletar</w:t>
+            </w:r>
+          </w:p>
+        </w:tc>
+        <w:tc>
+          <w:tcPr>
+            <w:tcW w:type="dxa" w:w="3300"/>
+            <w:shd w:fill="F2F2F2" w:val="clear"/>
+            <w:tcMar>
+              <w:top w:type="dxa" w:w="70"/>
+              <w:left w:type="dxa" w:w="110"/>
+              <w:bottom w:type="dxa" w:w="70"/>
+              <w:right w:type="dxa" w:w="110"/>
+            </w:tcMar>
+            <w:vAlign w:val="center"/>
+          </w:tcPr>
+          <w:p>
+            <w:pPr>
+              <w:spacing w:after="0"/>
+            </w:pPr>
+            <w:r>
+              <w:rPr>
+                <w:b w:val="false"/>
+                <w:bCs w:val="false"/>
+                <w:sz w:val="17"/>
+                <w:szCs w:val="17"/>
+              </w:rPr>
+              <w:t xml:space="preserve">SIM-AM: o ZIP de cada município no ano, com os contratos por contratado e os aditivos do ano</w:t>
+            </w:r>
+          </w:p>
+        </w:tc>
+        <w:tc>
+          <w:tcPr>
+            <w:tcW w:type="dxa" w:w="3900"/>
+            <w:shd w:fill="F2F2F2" w:val="clear"/>
+            <w:tcMar>
+              <w:top w:type="dxa" w:w="70"/>
+              <w:left w:type="dxa" w:w="110"/>
+              <w:bottom w:type="dxa" w:w="70"/>
+              <w:right w:type="dxa" w:w="110"/>
+            </w:tcMar>
+            <w:vAlign w:val="center"/>
+          </w:tcPr>
+          <w:p>
+            <w:pPr>
+              <w:spacing w:after="0"/>
+            </w:pPr>
+            <w:r>
+              <w:rPr>
+                <w:b w:val="false"/>
+                <w:bCs w:val="false"/>
+                <w:sz w:val="17"/>
+                <w:szCs w:val="17"/>
+              </w:rPr>
+              <w:t xml:space="preserve">O ZIP do estado só sinaliza mudança; consórcio sem ente; supressão entra negativa</w:t>
             </w:r>
           </w:p>
         </w:tc>

</xml_diff>

<commit_message>
Tribunais de contas: o TCE-PE (ADR-050, adendo)
- lumen painel tce-pe: os contratos dos órgãos pernambucanos, estaduais e municipais, de
  2013 em diante, pela API de dados abertos do tribunal (Contratos e TermoAditivo por ano;
  o município pelo nome, ligado ao código IBGE pelo método Municipios). Consórcio sem
  ente; pessoa física só na soma; consulta que chega ao limite vai para os problemas.
- tce.precisa_ler_por_idade: a API não diz se o ano mudou; o ano fechado é relido uma
  vez por mês, o corrente e o anterior uma vez por semana.
- O fluxo tce ganha o job do TCE-PE; a página da empresa passa a apontar para a lista
  de tribunais na wiki.
</commit_message>
<xml_diff>
--- a/docs/DOC-13_Paineis.docx
+++ b/docs/DOC-13_Paineis.docx
@@ -923,7 +923,7 @@
           </w:pPr>
           <w:hyperlink w:history="1" w:anchor="_Toc21">
             <w:r>
-              <w:t xml:space="preserve">4.16 tce.py, tce_rs.py e tce_pr.py</w:t>
+              <w:t xml:space="preserve">4.16 tce.py, tce_rs.py, tce_pr.py e tce_pe.py</w:t>
             </w:r>
             <w:r>
               <w:tab/>
@@ -11054,7 +11054,7 @@
       </w:pPr>
       <w:bookmarkStart w:name="_Toc21" w:id="21"/>
       <w:r>
-        <w:t xml:space="preserve">4.16 tce.py, tce_rs.py e tce_pr.py</w:t>
+        <w:t xml:space="preserve">4.16 tce.py, tce_rs.py, tce_pr.py e tce_pe.py</w:t>
       </w:r>
       <w:bookmarkEnd w:id="21"/>
     </w:p>
@@ -11682,6 +11682,93 @@
                 <w:szCs w:val="17"/>
               </w:rPr>
               <w:t xml:space="preserve">O ZIP do estado só sinaliza mudança; consórcio sem ente; supressão entra negativa</w:t>
+            </w:r>
+          </w:p>
+        </w:tc>
+      </w:tr>
+      <w:tr>
+        <w:trPr>
+          <w:cantSplit/>
+        </w:trPr>
+        <w:tc>
+          <w:tcPr>
+            <w:tcW w:type="dxa" w:w="2400"/>
+            <w:shd w:fill="FFFFFF" w:val="clear"/>
+            <w:tcMar>
+              <w:top w:type="dxa" w:w="70"/>
+              <w:left w:type="dxa" w:w="110"/>
+              <w:bottom w:type="dxa" w:w="70"/>
+              <w:right w:type="dxa" w:w="110"/>
+            </w:tcMar>
+            <w:vAlign w:val="center"/>
+          </w:tcPr>
+          <w:p>
+            <w:pPr>
+              <w:spacing w:after="0"/>
+            </w:pPr>
+            <w:r>
+              <w:rPr>
+                <w:rFonts w:ascii="Consolas" w:cs="Consolas" w:eastAsia="Consolas" w:hAnsi="Consolas"/>
+                <w:b w:val="false"/>
+                <w:bCs w:val="false"/>
+                <w:sz w:val="17"/>
+                <w:szCs w:val="17"/>
+              </w:rPr>
+              <w:t xml:space="preserve">tce_pe.consultar, somar_ano, coletar</w:t>
+            </w:r>
+          </w:p>
+        </w:tc>
+        <w:tc>
+          <w:tcPr>
+            <w:tcW w:type="dxa" w:w="3300"/>
+            <w:shd w:fill="FFFFFF" w:val="clear"/>
+            <w:tcMar>
+              <w:top w:type="dxa" w:w="70"/>
+              <w:left w:type="dxa" w:w="110"/>
+              <w:bottom w:type="dxa" w:w="70"/>
+              <w:right w:type="dxa" w:w="110"/>
+            </w:tcMar>
+            <w:vAlign w:val="center"/>
+          </w:tcPr>
+          <w:p>
+            <w:pPr>
+              <w:spacing w:after="0"/>
+            </w:pPr>
+            <w:r>
+              <w:rPr>
+                <w:b w:val="false"/>
+                <w:bCs w:val="false"/>
+                <w:sz w:val="17"/>
+                <w:szCs w:val="17"/>
+              </w:rPr>
+              <w:t xml:space="preserve">API do TCE-PE: contratos e aditivos do ano, município pelo nome</w:t>
+            </w:r>
+          </w:p>
+        </w:tc>
+        <w:tc>
+          <w:tcPr>
+            <w:tcW w:type="dxa" w:w="3900"/>
+            <w:shd w:fill="FFFFFF" w:val="clear"/>
+            <w:tcMar>
+              <w:top w:type="dxa" w:w="70"/>
+              <w:left w:type="dxa" w:w="110"/>
+              <w:bottom w:type="dxa" w:w="70"/>
+              <w:right w:type="dxa" w:w="110"/>
+            </w:tcMar>
+            <w:vAlign w:val="center"/>
+          </w:tcPr>
+          <w:p>
+            <w:pPr>
+              <w:spacing w:after="0"/>
+            </w:pPr>
+            <w:r>
+              <w:rPr>
+                <w:b w:val="false"/>
+                <w:bCs w:val="false"/>
+                <w:sz w:val="17"/>
+                <w:szCs w:val="17"/>
+              </w:rPr>
+              <w:t xml:space="preserve">Sem cabeçalho de mudança: ano fechado relido uma vez por mês (tce.precisa_ler_por_idade); consulta cortada vai para os problemas</w:t>
             </w:r>
           </w:p>
         </w:tc>

</xml_diff>

<commit_message>
Tribunais de contas: o TCE-CE (ADR-050, adendo)
Os 184 municípios cearenses ganham os contratos do SIM do TCE-CE, de 2003 em
diante, pela API de dados abertos (só do Brasil: no GitHub, pelo intermediário
em São Paulo). Por município e ano, contratos e contratados, página a página,
quatro municípios de cada vez; 2023 levou 11min42s e deu 99.743 contratos e
R$ 19,5 bilhões.

Contrato com um só CNPJ vai para a empresa; só pessoa física, para a soma
anônima; vários contratados ou nenhum, só para o total do município. Os
aditivos contam sem valor: o termo traz ora o acréscimo, ora o valor total
do contrato depois dele (em Fortaleza, somados, dariam R$ 16,1 bilhões de
"acréscimo" contra R$ 4,8 bilhões de contratos). SomaAno.aditivo aceita
valor ausente, e o portal diz que o tribunal não separa o acréscimo.
</commit_message>
<xml_diff>
--- a/docs/DOC-13_Paineis.docx
+++ b/docs/DOC-13_Paineis.docx
@@ -923,7 +923,7 @@
           </w:pPr>
           <w:hyperlink w:history="1" w:anchor="_Toc21">
             <w:r>
-              <w:t xml:space="preserve">4.16 tce.py, tce_rs.py, tce_pr.py e tce_pe.py</w:t>
+              <w:t xml:space="preserve">4.16 tce.py, tce_rs.py, tce_pr.py, tce_pe.py e tce_ce.py</w:t>
             </w:r>
             <w:r>
               <w:tab/>
@@ -11054,7 +11054,7 @@
       </w:pPr>
       <w:bookmarkStart w:name="_Toc21" w:id="21"/>
       <w:r>
-        <w:t xml:space="preserve">4.16 tce.py, tce_rs.py, tce_pr.py e tce_pe.py</w:t>
+        <w:t xml:space="preserve">4.16 tce.py, tce_rs.py, tce_pr.py, tce_pe.py e tce_ce.py</w:t>
       </w:r>
       <w:bookmarkEnd w:id="21"/>
     </w:p>
@@ -11769,6 +11769,93 @@
                 <w:szCs w:val="17"/>
               </w:rPr>
               <w:t xml:space="preserve">Sem cabeçalho de mudança: ano fechado relido uma vez por mês (tce.precisa_ler_por_idade); consulta cortada vai para os problemas</w:t>
+            </w:r>
+          </w:p>
+        </w:tc>
+      </w:tr>
+      <w:tr>
+        <w:trPr>
+          <w:cantSplit/>
+        </w:trPr>
+        <w:tc>
+          <w:tcPr>
+            <w:tcW w:type="dxa" w:w="2400"/>
+            <w:shd w:fill="F2F2F2" w:val="clear"/>
+            <w:tcMar>
+              <w:top w:type="dxa" w:w="70"/>
+              <w:left w:type="dxa" w:w="110"/>
+              <w:bottom w:type="dxa" w:w="70"/>
+              <w:right w:type="dxa" w:w="110"/>
+            </w:tcMar>
+            <w:vAlign w:val="center"/>
+          </w:tcPr>
+          <w:p>
+            <w:pPr>
+              <w:spacing w:after="0"/>
+            </w:pPr>
+            <w:r>
+              <w:rPr>
+                <w:rFonts w:ascii="Consolas" w:cs="Consolas" w:eastAsia="Consolas" w:hAnsi="Consolas"/>
+                <w:b w:val="false"/>
+                <w:bCs w:val="false"/>
+                <w:sz w:val="17"/>
+                <w:szCs w:val="17"/>
+              </w:rPr>
+              <w:t xml:space="preserve">tce_ce.consultar, ler_municipio, somar_ano, coletar</w:t>
+            </w:r>
+          </w:p>
+        </w:tc>
+        <w:tc>
+          <w:tcPr>
+            <w:tcW w:type="dxa" w:w="3300"/>
+            <w:shd w:fill="F2F2F2" w:val="clear"/>
+            <w:tcMar>
+              <w:top w:type="dxa" w:w="70"/>
+              <w:left w:type="dxa" w:w="110"/>
+              <w:bottom w:type="dxa" w:w="70"/>
+              <w:right w:type="dxa" w:w="110"/>
+            </w:tcMar>
+            <w:vAlign w:val="center"/>
+          </w:tcPr>
+          <w:p>
+            <w:pPr>
+              <w:spacing w:after="0"/>
+            </w:pPr>
+            <w:r>
+              <w:rPr>
+                <w:b w:val="false"/>
+                <w:bCs w:val="false"/>
+                <w:sz w:val="17"/>
+                <w:szCs w:val="17"/>
+              </w:rPr>
+              <w:t xml:space="preserve">API do SIM do TCE-CE: contratos e contratados do município no ano, página a página, quatro municípios de cada vez</w:t>
+            </w:r>
+          </w:p>
+        </w:tc>
+        <w:tc>
+          <w:tcPr>
+            <w:tcW w:type="dxa" w:w="3900"/>
+            <w:shd w:fill="F2F2F2" w:val="clear"/>
+            <w:tcMar>
+              <w:top w:type="dxa" w:w="70"/>
+              <w:left w:type="dxa" w:w="110"/>
+              <w:bottom w:type="dxa" w:w="70"/>
+              <w:right w:type="dxa" w:w="110"/>
+            </w:tcMar>
+            <w:vAlign w:val="center"/>
+          </w:tcPr>
+          <w:p>
+            <w:pPr>
+              <w:spacing w:after="0"/>
+            </w:pPr>
+            <w:r>
+              <w:rPr>
+                <w:b w:val="false"/>
+                <w:bCs w:val="false"/>
+                <w:sz w:val="17"/>
+                <w:szCs w:val="17"/>
+              </w:rPr>
+              <w:t xml:space="preserve">Contrato com um só CNPJ vai para a empresa; com vários contratados ou nenhum, só para o total; aditivos contam sem valor (o termo traz ora o acréscimo, ora o valor total); ano com município que falhou não é gravado</w:t>
             </w:r>
           </w:p>
         </w:tc>

</xml_diff>

<commit_message>
Página da empresa: pagamentos da União por favorecido (ADR-058)
Fecha o último entregável da Fase 1 (#36). O arquivo mensal de recebimentos
por favorecido da CGU (despesas-favorecidos, de 2014 em diante, sem chave)
dá, por CNPJ, ano e órgão superior, o que a União pagou: 174 mil CNPJs e
R$ 95,9 bilhões em setembro de 2026. A coleta segue a das transferências
(três meses recentes refeitos, até 12 por execução, com pausa) e o
recebido entra na página da empresa e no peso da busca; quem só recebeu
da União passa a ter página.
</commit_message>
<xml_diff>
--- a/docs/DOC-13_Paineis.docx
+++ b/docs/DOC-13_Paineis.docx
@@ -900,7 +900,7 @@
           </w:pPr>
           <w:hyperlink w:history="1" w:anchor="_Toc20">
             <w:r>
-              <w:t xml:space="preserve">4.15 cobertura.py</w:t>
+              <w:t xml:space="preserve">4.14b recebimentos.py</w:t>
             </w:r>
             <w:r>
               <w:tab/>
@@ -923,7 +923,7 @@
           </w:pPr>
           <w:hyperlink w:history="1" w:anchor="_Toc21">
             <w:r>
-              <w:t xml:space="preserve">4.16 tce.py, tce_rs.py, tce_pr.py, tce_pe.py e tce_ce.py</w:t>
+              <w:t xml:space="preserve">4.15 cobertura.py</w:t>
             </w:r>
             <w:r>
               <w:tab/>
@@ -946,7 +946,7 @@
           </w:pPr>
           <w:hyperlink w:history="1" w:anchor="_Toc22">
             <w:r>
-              <w:t xml:space="preserve">4.17 pessoas_juridicas.py</w:t>
+              <w:t xml:space="preserve">4.16 tce.py, tce_rs.py, tce_pr.py, tce_pe.py e tce_ce.py</w:t>
             </w:r>
             <w:r>
               <w:tab/>
@@ -961,14 +961,15 @@
         </w:p>
         <w:p>
           <w:pPr>
-            <w:pStyle w:val="TOC1"/>
+            <w:pStyle w:val="TOC2"/>
             <w:tabs>
               <w:tab w:val="right" w:pos="9638" w:leader="dot"/>
             </w:tabs>
+            <w:ind w:left="220"/>
           </w:pPr>
           <w:hyperlink w:history="1" w:anchor="_Toc23">
             <w:r>
-              <w:t xml:space="preserve">5. Estado guardado entre execuções</w:t>
+              <w:t xml:space="preserve">4.17 pessoas_juridicas.py</w:t>
             </w:r>
             <w:r>
               <w:tab/>
@@ -990,7 +991,7 @@
           </w:pPr>
           <w:hyperlink w:history="1" w:anchor="_Toc24">
             <w:r>
-              <w:t xml:space="preserve">6. Site publicado</w:t>
+              <w:t xml:space="preserve">5. Estado guardado entre execuções</w:t>
             </w:r>
             <w:r>
               <w:tab/>
@@ -1012,7 +1013,7 @@
           </w:pPr>
           <w:hyperlink w:history="1" w:anchor="_Toc25">
             <w:r>
-              <w:t xml:space="preserve">7. Regras de soma das contratações</w:t>
+              <w:t xml:space="preserve">6. Site publicado</w:t>
             </w:r>
             <w:r>
               <w:tab/>
@@ -1034,7 +1035,7 @@
           </w:pPr>
           <w:hyperlink w:history="1" w:anchor="_Toc26">
             <w:r>
-              <w:t xml:space="preserve">8. Avaliação da conformidade</w:t>
+              <w:t xml:space="preserve">7. Regras de soma das contratações</w:t>
             </w:r>
             <w:r>
               <w:tab/>
@@ -1042,6 +1043,28 @@
             <w:r>
               <w:fldChar w:fldCharType="begin" w:dirty="true"/>
               <w:instrText xml:space="preserve">PAGEREF _Toc26 \h</w:instrText>
+              <w:fldChar w:fldCharType="separate"/>
+              <w:fldChar w:fldCharType="end"/>
+            </w:r>
+          </w:hyperlink>
+        </w:p>
+        <w:p>
+          <w:pPr>
+            <w:pStyle w:val="TOC1"/>
+            <w:tabs>
+              <w:tab w:val="right" w:pos="9638" w:leader="dot"/>
+            </w:tabs>
+          </w:pPr>
+          <w:hyperlink w:history="1" w:anchor="_Toc27">
+            <w:r>
+              <w:t xml:space="preserve">8. Avaliação da conformidade</w:t>
+            </w:r>
+            <w:r>
+              <w:tab/>
+            </w:r>
+            <w:r>
+              <w:fldChar w:fldCharType="begin" w:dirty="true"/>
+              <w:instrText xml:space="preserve">PAGEREF _Toc27 \h</w:instrText>
               <w:fldChar w:fldCharType="separate"/>
               <w:fldChar w:fldCharType="end"/>
             </w:r>
@@ -1055,31 +1078,9 @@
             </w:tabs>
             <w:ind w:left="220"/>
           </w:pPr>
-          <w:hyperlink w:history="1" w:anchor="_Toc27">
+          <w:hyperlink w:history="1" w:anchor="_Toc28">
             <w:r>
               <w:t xml:space="preserve">8.1 Comparação com o grupo de pares (ADR-038)</w:t>
-            </w:r>
-            <w:r>
-              <w:tab/>
-            </w:r>
-            <w:r>
-              <w:fldChar w:fldCharType="begin" w:dirty="true"/>
-              <w:instrText xml:space="preserve">PAGEREF _Toc27 \h</w:instrText>
-              <w:fldChar w:fldCharType="separate"/>
-              <w:fldChar w:fldCharType="end"/>
-            </w:r>
-          </w:hyperlink>
-        </w:p>
-        <w:p>
-          <w:pPr>
-            <w:pStyle w:val="TOC1"/>
-            <w:tabs>
-              <w:tab w:val="right" w:pos="9638" w:leader="dot"/>
-            </w:tabs>
-          </w:pPr>
-          <w:hyperlink w:history="1" w:anchor="_Toc28">
-            <w:r>
-              <w:t xml:space="preserve">9. Portal</w:t>
             </w:r>
             <w:r>
               <w:tab/>
@@ -1101,7 +1102,7 @@
           </w:pPr>
           <w:hyperlink w:history="1" w:anchor="_Toc29">
             <w:r>
-              <w:t xml:space="preserve">10. Operação</w:t>
+              <w:t xml:space="preserve">9. Portal</w:t>
             </w:r>
             <w:r>
               <w:tab/>
@@ -1116,15 +1117,14 @@
         </w:p>
         <w:p>
           <w:pPr>
-            <w:pStyle w:val="TOC3"/>
+            <w:pStyle w:val="TOC1"/>
             <w:tabs>
               <w:tab w:val="right" w:pos="9638" w:leader="dot"/>
             </w:tabs>
-            <w:ind w:left="440"/>
           </w:pPr>
           <w:hyperlink w:history="1" w:anchor="_Toc30">
             <w:r>
-              <w:t xml:space="preserve">Configuração, uma vez</w:t>
+              <w:t xml:space="preserve">10. Operação</w:t>
             </w:r>
             <w:r>
               <w:tab/>
@@ -1147,7 +1147,7 @@
           </w:pPr>
           <w:hyperlink w:history="1" w:anchor="_Toc31">
             <w:r>
-              <w:t xml:space="preserve">Comandos locais</w:t>
+              <w:t xml:space="preserve">Configuração, uma vez</w:t>
             </w:r>
             <w:r>
               <w:tab/>
@@ -1170,7 +1170,7 @@
           </w:pPr>
           <w:hyperlink w:history="1" w:anchor="_Toc32">
             <w:r>
-              <w:t xml:space="preserve">Limites</w:t>
+              <w:t xml:space="preserve">Comandos locais</w:t>
             </w:r>
             <w:r>
               <w:tab/>
@@ -1185,14 +1185,15 @@
         </w:p>
         <w:p>
           <w:pPr>
-            <w:pStyle w:val="TOC1"/>
+            <w:pStyle w:val="TOC3"/>
             <w:tabs>
               <w:tab w:val="right" w:pos="9638" w:leader="dot"/>
             </w:tabs>
+            <w:ind w:left="440"/>
           </w:pPr>
           <w:hyperlink w:history="1" w:anchor="_Toc33">
             <w:r>
-              <w:t xml:space="preserve">11. Verificação</w:t>
+              <w:t xml:space="preserve">Limites</w:t>
             </w:r>
             <w:r>
               <w:tab/>
@@ -1214,7 +1215,7 @@
           </w:pPr>
           <w:hyperlink w:history="1" w:anchor="_Toc34">
             <w:r>
-              <w:t xml:space="preserve">12. Próximos passos e riscos</w:t>
+              <w:t xml:space="preserve">11. Verificação</w:t>
             </w:r>
             <w:r>
               <w:tab/>
@@ -1222,6 +1223,28 @@
             <w:r>
               <w:fldChar w:fldCharType="begin" w:dirty="true"/>
               <w:instrText xml:space="preserve">PAGEREF _Toc34 \h</w:instrText>
+              <w:fldChar w:fldCharType="separate"/>
+              <w:fldChar w:fldCharType="end"/>
+            </w:r>
+          </w:hyperlink>
+        </w:p>
+        <w:p>
+          <w:pPr>
+            <w:pStyle w:val="TOC1"/>
+            <w:tabs>
+              <w:tab w:val="right" w:pos="9638" w:leader="dot"/>
+            </w:tabs>
+          </w:pPr>
+          <w:hyperlink w:history="1" w:anchor="_Toc35">
+            <w:r>
+              <w:t xml:space="preserve">12. Próximos passos e riscos</w:t>
+            </w:r>
+            <w:r>
+              <w:tab/>
+            </w:r>
+            <w:r>
+              <w:fldChar w:fldCharType="begin" w:dirty="true"/>
+              <w:instrText xml:space="preserve">PAGEREF _Toc35 \h</w:instrText>
               <w:fldChar w:fldCharType="separate"/>
               <w:fldChar w:fldCharType="end"/>
             </w:r>
@@ -10586,7 +10609,7 @@
       </w:pPr>
       <w:bookmarkStart w:name="_Toc20" w:id="20"/>
       <w:r>
-        <w:t xml:space="preserve">4.15 cobertura.py</w:t>
+        <w:t xml:space="preserve">4.14b recebimentos.py</w:t>
       </w:r>
       <w:bookmarkEnd w:id="20"/>
     </w:p>
@@ -10724,7 +10747,7 @@
                 <w:sz w:val="17"/>
                 <w:szCs w:val="17"/>
               </w:rPr>
-              <w:t xml:space="preserve">anos_com_publicacao</w:t>
+              <w:t xml:space="preserve">meses_disponiveis, baixar</w:t>
             </w:r>
           </w:p>
         </w:tc>
@@ -10751,7 +10774,7 @@
                 <w:sz w:val="17"/>
                 <w:szCs w:val="17"/>
               </w:rPr>
-              <w:t xml:space="preserve">Os anos com ao menos um processo ou um contrato no acumulador do ente</w:t>
+              <w:t xml:space="preserve">Os meses da página de download e o ZIP de recebimentos por favorecido do mês</w:t>
             </w:r>
           </w:p>
         </w:tc>
@@ -10778,7 +10801,7 @@
                 <w:sz w:val="17"/>
                 <w:szCs w:val="17"/>
               </w:rPr>
-              <w:t xml:space="preserve">Mês sem nada não conta</w:t>
+              <w:t xml:space="preserve">Arquivo mensal de dados abertos da CGU, sem chave, de 2014 em diante; verificação humana para a coleta</w:t>
             </w:r>
           </w:p>
         </w:tc>
@@ -10811,7 +10834,7 @@
                 <w:sz w:val="17"/>
                 <w:szCs w:val="17"/>
               </w:rPr>
-              <w:t xml:space="preserve">ate_20_mil</w:t>
+              <w:t xml:space="preserve">somar_mes, coletar (lumen painel recebimentos)</w:t>
             </w:r>
           </w:p>
         </w:tc>
@@ -10838,7 +10861,7 @@
                 <w:sz w:val="17"/>
                 <w:szCs w:val="17"/>
               </w:rPr>
-              <w:t xml:space="preserve">Se o município tem até 20 mil habitantes pela população do cadastro</w:t>
+              <w:t xml:space="preserve">Por CNPJ, ano e órgão superior, o recebido da União; o nome mais recente de cada CNPJ</w:t>
             </w:r>
           </w:p>
         </w:tc>
@@ -10865,7 +10888,7 @@
                 <w:sz w:val="17"/>
                 <w:szCs w:val="17"/>
               </w:rPr>
-              <w:t xml:space="preserve">Lei 14.133, art. 176: até 1º/4/2027 para divulgar no PNCP; até lá, diário oficial</w:t>
+              <w:t xml:space="preserve">Três meses recentes refeitos a cada execução; até 12 meses por execução, com pausa; o que não é CNPJ só contado (ADR-058)</w:t>
             </w:r>
           </w:p>
         </w:tc>
@@ -10898,7 +10921,7 @@
                 <w:sz w:val="17"/>
                 <w:szCs w:val="17"/>
               </w:rPr>
-              <w:t xml:space="preserve">montar</w:t>
+              <w:t xml:space="preserve">pessoas_juridicas.de_recebimentos</w:t>
             </w:r>
           </w:p>
         </w:tc>
@@ -10925,7 +10948,7 @@
                 <w:sz w:val="17"/>
                 <w:szCs w:val="17"/>
               </w:rPr>
-              <w:t xml:space="preserve">cobertura.json: uma linha por estado, DF e município, somas por UF e do Brasil, a União à parte</w:t>
+              <w:t xml:space="preserve">O recebido entra na página da empresa (uniao: ano, órgão, valor) e no peso da busca</w:t>
             </w:r>
           </w:p>
         </w:tc>
@@ -10952,94 +10975,7 @@
                 <w:sz w:val="17"/>
                 <w:szCs w:val="17"/>
               </w:rPr>
-              <w:t xml:space="preserve">Critério de saída da Fase 1 (ADR-048); mede o que o Lumen tem, não avalia o ente</w:t>
-            </w:r>
-          </w:p>
-        </w:tc>
-      </w:tr>
-      <w:tr>
-        <w:trPr>
-          <w:cantSplit/>
-        </w:trPr>
-        <w:tc>
-          <w:tcPr>
-            <w:tcW w:type="dxa" w:w="2400"/>
-            <w:shd w:fill="F2F2F2" w:val="clear"/>
-            <w:tcMar>
-              <w:top w:type="dxa" w:w="70"/>
-              <w:left w:type="dxa" w:w="110"/>
-              <w:bottom w:type="dxa" w:w="70"/>
-              <w:right w:type="dxa" w:w="110"/>
-            </w:tcMar>
-            <w:vAlign w:val="center"/>
-          </w:tcPr>
-          <w:p>
-            <w:pPr>
-              <w:spacing w:after="0"/>
-            </w:pPr>
-            <w:r>
-              <w:rPr>
-                <w:rFonts w:ascii="Consolas" w:cs="Consolas" w:eastAsia="Consolas" w:hAnsi="Consolas"/>
-                <w:b w:val="false"/>
-                <w:bCs w:val="false"/>
-                <w:sz w:val="17"/>
-                <w:szCs w:val="17"/>
-              </w:rPr>
-              <w:t xml:space="preserve">sem_ente</w:t>
-            </w:r>
-          </w:p>
-        </w:tc>
-        <w:tc>
-          <w:tcPr>
-            <w:tcW w:type="dxa" w:w="3300"/>
-            <w:shd w:fill="F2F2F2" w:val="clear"/>
-            <w:tcMar>
-              <w:top w:type="dxa" w:w="70"/>
-              <w:left w:type="dxa" w:w="110"/>
-              <w:bottom w:type="dxa" w:w="70"/>
-              <w:right w:type="dxa" w:w="110"/>
-            </w:tcMar>
-            <w:vAlign w:val="center"/>
-          </w:tcPr>
-          <w:p>
-            <w:pPr>
-              <w:spacing w:after="0"/>
-            </w:pPr>
-            <w:r>
-              <w:rPr>
-                <w:b w:val="false"/>
-                <w:bCs w:val="false"/>
-                <w:sz w:val="17"/>
-                <w:szCs w:val="17"/>
-              </w:rPr>
-              <w:t xml:space="preserve">O publicado sem ente: totais, fração dos processos e do valor e os 20 órgãos sem ente com mais processos</w:t>
-            </w:r>
-          </w:p>
-        </w:tc>
-        <w:tc>
-          <w:tcPr>
-            <w:tcW w:type="dxa" w:w="3900"/>
-            <w:shd w:fill="F2F2F2" w:val="clear"/>
-            <w:tcMar>
-              <w:top w:type="dxa" w:w="70"/>
-              <w:left w:type="dxa" w:w="110"/>
-              <w:bottom w:type="dxa" w:w="70"/>
-              <w:right w:type="dxa" w:w="110"/>
-            </w:tcMar>
-            <w:vAlign w:val="center"/>
-          </w:tcPr>
-          <w:p>
-            <w:pPr>
-              <w:spacing w:after="0"/>
-            </w:pPr>
-            <w:r>
-              <w:rPr>
-                <w:b w:val="false"/>
-                <w:bCs w:val="false"/>
-                <w:sz w:val="17"/>
-                <w:szCs w:val="17"/>
-              </w:rPr>
-              <w:t xml:space="preserve">Fica no panorama do Brasil e fora das linhas; em 2026, 9,8% do valor estimado, depois das estatais federais</w:t>
+              <w:t xml:space="preserve">Quem só recebeu da União também entra no índice</w:t>
             </w:r>
           </w:p>
         </w:tc>
@@ -11054,7 +10990,7 @@
       </w:pPr>
       <w:bookmarkStart w:name="_Toc21" w:id="21"/>
       <w:r>
-        <w:t xml:space="preserve">4.16 tce.py, tce_rs.py, tce_pr.py, tce_pe.py e tce_ce.py</w:t>
+        <w:t xml:space="preserve">4.15 cobertura.py</w:t>
       </w:r>
       <w:bookmarkEnd w:id="21"/>
     </w:p>
@@ -11192,7 +11128,7 @@
                 <w:sz w:val="17"/>
                 <w:szCs w:val="17"/>
               </w:rPr>
-              <w:t xml:space="preserve">tce.cabecalho, tce.ArquivoRemoto</w:t>
+              <w:t xml:space="preserve">anos_com_publicacao</w:t>
             </w:r>
           </w:p>
         </w:tc>
@@ -11219,7 +11155,7 @@
                 <w:sz w:val="17"/>
                 <w:szCs w:val="17"/>
               </w:rPr>
-              <w:t xml:space="preserve">O tamanho e a etiqueta de cada arquivo e a leitura por partes (Range)</w:t>
+              <w:t xml:space="preserve">Os anos com ao menos um processo ou um contrato no acumulador do ente</w:t>
             </w:r>
           </w:p>
         </w:tc>
@@ -11246,7 +11182,7 @@
                 <w:sz w:val="17"/>
                 <w:szCs w:val="17"/>
               </w:rPr>
-              <w:t xml:space="preserve">Cada ZIP anual do TCE-RS repete a tabela de pessoas (80 MB); lendo por partes, cada ano custa uns 5 MB</w:t>
+              <w:t xml:space="preserve">Mês sem nada não conta</w:t>
             </w:r>
           </w:p>
         </w:tc>
@@ -11279,7 +11215,7 @@
                 <w:sz w:val="17"/>
                 <w:szCs w:val="17"/>
               </w:rPr>
-              <w:t xml:space="preserve">tce.SomaAno</w:t>
+              <w:t xml:space="preserve">ate_20_mil</w:t>
             </w:r>
           </w:p>
         </w:tc>
@@ -11306,7 +11242,7 @@
                 <w:sz w:val="17"/>
                 <w:szCs w:val="17"/>
               </w:rPr>
-              <w:t xml:space="preserve">A soma de um ano por ente (contratos, valor, fora do teto, pessoa física, aditivos) e por CNPJ</w:t>
+              <w:t xml:space="preserve">Se o município tem até 20 mil habitantes pela população do cadastro</w:t>
             </w:r>
           </w:p>
         </w:tc>
@@ -11333,7 +11269,7 @@
                 <w:sz w:val="17"/>
                 <w:szCs w:val="17"/>
               </w:rPr>
-              <w:t xml:space="preserve">Mesmo teto de plausibilidade do PNCP; o CPF nunca é guardado</w:t>
+              <w:t xml:space="preserve">Lei 14.133, art. 176: até 1º/4/2027 para divulgar no PNCP; até lá, diário oficial</w:t>
             </w:r>
           </w:p>
         </w:tc>
@@ -11366,7 +11302,7 @@
                 <w:sz w:val="17"/>
                 <w:szCs w:val="17"/>
               </w:rPr>
-              <w:t xml:space="preserve">tce.precisa_ler</w:t>
+              <w:t xml:space="preserve">montar</w:t>
             </w:r>
           </w:p>
         </w:tc>
@@ -11393,7 +11329,7 @@
                 <w:sz w:val="17"/>
                 <w:szCs w:val="17"/>
               </w:rPr>
-              <w:t xml:space="preserve">Se o ano tem de ser lido de novo</w:t>
+              <w:t xml:space="preserve">cobertura.json: uma linha por estado, DF e município, somas por UF e do Brasil, a União à parte</w:t>
             </w:r>
           </w:p>
         </w:tc>
@@ -11420,7 +11356,7 @@
                 <w:sz w:val="17"/>
                 <w:szCs w:val="17"/>
               </w:rPr>
-              <w:t xml:space="preserve">Ano fechado só quando muda de tamanho; o corrente e o anterior, uma vez por semana</w:t>
+              <w:t xml:space="preserve">Critério de saída da Fase 1 (ADR-048); mede o que o Lumen tem, não avalia o ente</w:t>
             </w:r>
           </w:p>
         </w:tc>
@@ -11453,7 +11389,7 @@
                 <w:sz w:val="17"/>
                 <w:szCs w:val="17"/>
               </w:rPr>
-              <w:t xml:space="preserve">tce.publicar</w:t>
+              <w:t xml:space="preserve">sem_ente</w:t>
             </w:r>
           </w:p>
         </w:tc>
@@ -11480,7 +11416,7 @@
                 <w:sz w:val="17"/>
                 <w:szCs w:val="17"/>
               </w:rPr>
-              <w:t xml:space="preserve">tce/ente/&lt;grupo&gt;.json.gz: por ente, o tribunal, os anos e os 100 maiores fornecedores</w:t>
+              <w:t xml:space="preserve">O publicado sem ente: totais, fração dos processos e do valor e os 20 órgãos sem ente com mais processos</w:t>
             </w:r>
           </w:p>
         </w:tc>
@@ -11507,355 +11443,7 @@
                 <w:sz w:val="17"/>
                 <w:szCs w:val="17"/>
               </w:rPr>
-              <w:t xml:space="preserve">Junta os tribunais; lido no mandato aberto de Governos municipais; não se soma ao PNCP (ADR-050)</w:t>
-            </w:r>
-          </w:p>
-        </w:tc>
-      </w:tr>
-      <w:tr>
-        <w:trPr>
-          <w:cantSplit/>
-        </w:trPr>
-        <w:tc>
-          <w:tcPr>
-            <w:tcW w:type="dxa" w:w="2400"/>
-            <w:shd w:fill="FFFFFF" w:val="clear"/>
-            <w:tcMar>
-              <w:top w:type="dxa" w:w="70"/>
-              <w:left w:type="dxa" w:w="110"/>
-              <w:bottom w:type="dxa" w:w="70"/>
-              <w:right w:type="dxa" w:w="110"/>
-            </w:tcMar>
-            <w:vAlign w:val="center"/>
-          </w:tcPr>
-          <w:p>
-            <w:pPr>
-              <w:spacing w:after="0"/>
-            </w:pPr>
-            <w:r>
-              <w:rPr>
-                <w:rFonts w:ascii="Consolas" w:cs="Consolas" w:eastAsia="Consolas" w:hAnsi="Consolas"/>
-                <w:b w:val="false"/>
-                <w:bCs w:val="false"/>
-                <w:sz w:val="17"/>
-                <w:szCs w:val="17"/>
-              </w:rPr>
-              <w:t xml:space="preserve">tce_rs.ler_orgaos, ler_ano, ler_nomes, coletar</w:t>
-            </w:r>
-          </w:p>
-        </w:tc>
-        <w:tc>
-          <w:tcPr>
-            <w:tcW w:type="dxa" w:w="3300"/>
-            <w:shd w:fill="FFFFFF" w:val="clear"/>
-            <w:tcMar>
-              <w:top w:type="dxa" w:w="70"/>
-              <w:left w:type="dxa" w:w="110"/>
-              <w:bottom w:type="dxa" w:w="70"/>
-              <w:right w:type="dxa" w:w="110"/>
-            </w:tcMar>
-            <w:vAlign w:val="center"/>
-          </w:tcPr>
-          <w:p>
-            <w:pPr>
-              <w:spacing w:after="0"/>
-            </w:pPr>
-            <w:r>
-              <w:rPr>
-                <w:b w:val="false"/>
-                <w:bCs w:val="false"/>
-                <w:sz w:val="17"/>
-                <w:szCs w:val="17"/>
-              </w:rPr>
-              <w:t xml:space="preserve">LicitaCon: órgão no ente, contratos e aditivos do ano, nomes das empresas</w:t>
-            </w:r>
-          </w:p>
-        </w:tc>
-        <w:tc>
-          <w:tcPr>
-            <w:tcW w:type="dxa" w:w="3900"/>
-            <w:shd w:fill="FFFFFF" w:val="clear"/>
-            <w:tcMar>
-              <w:top w:type="dxa" w:w="70"/>
-              <w:left w:type="dxa" w:w="110"/>
-              <w:bottom w:type="dxa" w:w="70"/>
-              <w:right w:type="dxa" w:w="110"/>
-            </w:tcMar>
-            <w:vAlign w:val="center"/>
-          </w:tcPr>
-          <w:p>
-            <w:pPr>
-              <w:spacing w:after="0"/>
-            </w:pPr>
-            <w:r>
-              <w:rPr>
-                <w:b w:val="false"/>
-                <w:bCs w:val="false"/>
-                <w:sz w:val="17"/>
-                <w:szCs w:val="17"/>
-              </w:rPr>
-              <w:t xml:space="preserve">Consórcios e associações sem ente; o nome do MEI sai mascarado</w:t>
-            </w:r>
-          </w:p>
-        </w:tc>
-      </w:tr>
-      <w:tr>
-        <w:trPr>
-          <w:cantSplit/>
-        </w:trPr>
-        <w:tc>
-          <w:tcPr>
-            <w:tcW w:type="dxa" w:w="2400"/>
-            <w:shd w:fill="F2F2F2" w:val="clear"/>
-            <w:tcMar>
-              <w:top w:type="dxa" w:w="70"/>
-              <w:left w:type="dxa" w:w="110"/>
-              <w:bottom w:type="dxa" w:w="70"/>
-              <w:right w:type="dxa" w:w="110"/>
-            </w:tcMar>
-            <w:vAlign w:val="center"/>
-          </w:tcPr>
-          <w:p>
-            <w:pPr>
-              <w:spacing w:after="0"/>
-            </w:pPr>
-            <w:r>
-              <w:rPr>
-                <w:rFonts w:ascii="Consolas" w:cs="Consolas" w:eastAsia="Consolas" w:hAnsi="Consolas"/>
-                <w:b w:val="false"/>
-                <w:bCs w:val="false"/>
-                <w:sz w:val="17"/>
-                <w:szCs w:val="17"/>
-              </w:rPr>
-              <w:t xml:space="preserve">tce_pr.ler_municipio, coletar</w:t>
-            </w:r>
-          </w:p>
-        </w:tc>
-        <w:tc>
-          <w:tcPr>
-            <w:tcW w:type="dxa" w:w="3300"/>
-            <w:shd w:fill="F2F2F2" w:val="clear"/>
-            <w:tcMar>
-              <w:top w:type="dxa" w:w="70"/>
-              <w:left w:type="dxa" w:w="110"/>
-              <w:bottom w:type="dxa" w:w="70"/>
-              <w:right w:type="dxa" w:w="110"/>
-            </w:tcMar>
-            <w:vAlign w:val="center"/>
-          </w:tcPr>
-          <w:p>
-            <w:pPr>
-              <w:spacing w:after="0"/>
-            </w:pPr>
-            <w:r>
-              <w:rPr>
-                <w:b w:val="false"/>
-                <w:bCs w:val="false"/>
-                <w:sz w:val="17"/>
-                <w:szCs w:val="17"/>
-              </w:rPr>
-              <w:t xml:space="preserve">SIM-AM: o ZIP de cada município no ano, com os contratos por contratado e os aditivos do ano</w:t>
-            </w:r>
-          </w:p>
-        </w:tc>
-        <w:tc>
-          <w:tcPr>
-            <w:tcW w:type="dxa" w:w="3900"/>
-            <w:shd w:fill="F2F2F2" w:val="clear"/>
-            <w:tcMar>
-              <w:top w:type="dxa" w:w="70"/>
-              <w:left w:type="dxa" w:w="110"/>
-              <w:bottom w:type="dxa" w:w="70"/>
-              <w:right w:type="dxa" w:w="110"/>
-            </w:tcMar>
-            <w:vAlign w:val="center"/>
-          </w:tcPr>
-          <w:p>
-            <w:pPr>
-              <w:spacing w:after="0"/>
-            </w:pPr>
-            <w:r>
-              <w:rPr>
-                <w:b w:val="false"/>
-                <w:bCs w:val="false"/>
-                <w:sz w:val="17"/>
-                <w:szCs w:val="17"/>
-              </w:rPr>
-              <w:t xml:space="preserve">O ZIP do estado só sinaliza mudança; consórcio sem ente; supressão entra negativa</w:t>
-            </w:r>
-          </w:p>
-        </w:tc>
-      </w:tr>
-      <w:tr>
-        <w:trPr>
-          <w:cantSplit/>
-        </w:trPr>
-        <w:tc>
-          <w:tcPr>
-            <w:tcW w:type="dxa" w:w="2400"/>
-            <w:shd w:fill="FFFFFF" w:val="clear"/>
-            <w:tcMar>
-              <w:top w:type="dxa" w:w="70"/>
-              <w:left w:type="dxa" w:w="110"/>
-              <w:bottom w:type="dxa" w:w="70"/>
-              <w:right w:type="dxa" w:w="110"/>
-            </w:tcMar>
-            <w:vAlign w:val="center"/>
-          </w:tcPr>
-          <w:p>
-            <w:pPr>
-              <w:spacing w:after="0"/>
-            </w:pPr>
-            <w:r>
-              <w:rPr>
-                <w:rFonts w:ascii="Consolas" w:cs="Consolas" w:eastAsia="Consolas" w:hAnsi="Consolas"/>
-                <w:b w:val="false"/>
-                <w:bCs w:val="false"/>
-                <w:sz w:val="17"/>
-                <w:szCs w:val="17"/>
-              </w:rPr>
-              <w:t xml:space="preserve">tce_pe.consultar, somar_ano, coletar</w:t>
-            </w:r>
-          </w:p>
-        </w:tc>
-        <w:tc>
-          <w:tcPr>
-            <w:tcW w:type="dxa" w:w="3300"/>
-            <w:shd w:fill="FFFFFF" w:val="clear"/>
-            <w:tcMar>
-              <w:top w:type="dxa" w:w="70"/>
-              <w:left w:type="dxa" w:w="110"/>
-              <w:bottom w:type="dxa" w:w="70"/>
-              <w:right w:type="dxa" w:w="110"/>
-            </w:tcMar>
-            <w:vAlign w:val="center"/>
-          </w:tcPr>
-          <w:p>
-            <w:pPr>
-              <w:spacing w:after="0"/>
-            </w:pPr>
-            <w:r>
-              <w:rPr>
-                <w:b w:val="false"/>
-                <w:bCs w:val="false"/>
-                <w:sz w:val="17"/>
-                <w:szCs w:val="17"/>
-              </w:rPr>
-              <w:t xml:space="preserve">API do TCE-PE: contratos e aditivos do ano, município pelo nome</w:t>
-            </w:r>
-          </w:p>
-        </w:tc>
-        <w:tc>
-          <w:tcPr>
-            <w:tcW w:type="dxa" w:w="3900"/>
-            <w:shd w:fill="FFFFFF" w:val="clear"/>
-            <w:tcMar>
-              <w:top w:type="dxa" w:w="70"/>
-              <w:left w:type="dxa" w:w="110"/>
-              <w:bottom w:type="dxa" w:w="70"/>
-              <w:right w:type="dxa" w:w="110"/>
-            </w:tcMar>
-            <w:vAlign w:val="center"/>
-          </w:tcPr>
-          <w:p>
-            <w:pPr>
-              <w:spacing w:after="0"/>
-            </w:pPr>
-            <w:r>
-              <w:rPr>
-                <w:b w:val="false"/>
-                <w:bCs w:val="false"/>
-                <w:sz w:val="17"/>
-                <w:szCs w:val="17"/>
-              </w:rPr>
-              <w:t xml:space="preserve">Sem cabeçalho de mudança: ano fechado relido uma vez por mês (tce.precisa_ler_por_idade); consulta cortada vai para os problemas</w:t>
-            </w:r>
-          </w:p>
-        </w:tc>
-      </w:tr>
-      <w:tr>
-        <w:trPr>
-          <w:cantSplit/>
-        </w:trPr>
-        <w:tc>
-          <w:tcPr>
-            <w:tcW w:type="dxa" w:w="2400"/>
-            <w:shd w:fill="F2F2F2" w:val="clear"/>
-            <w:tcMar>
-              <w:top w:type="dxa" w:w="70"/>
-              <w:left w:type="dxa" w:w="110"/>
-              <w:bottom w:type="dxa" w:w="70"/>
-              <w:right w:type="dxa" w:w="110"/>
-            </w:tcMar>
-            <w:vAlign w:val="center"/>
-          </w:tcPr>
-          <w:p>
-            <w:pPr>
-              <w:spacing w:after="0"/>
-            </w:pPr>
-            <w:r>
-              <w:rPr>
-                <w:rFonts w:ascii="Consolas" w:cs="Consolas" w:eastAsia="Consolas" w:hAnsi="Consolas"/>
-                <w:b w:val="false"/>
-                <w:bCs w:val="false"/>
-                <w:sz w:val="17"/>
-                <w:szCs w:val="17"/>
-              </w:rPr>
-              <w:t xml:space="preserve">tce_ce.consultar, ler_municipio, somar_ano, coletar</w:t>
-            </w:r>
-          </w:p>
-        </w:tc>
-        <w:tc>
-          <w:tcPr>
-            <w:tcW w:type="dxa" w:w="3300"/>
-            <w:shd w:fill="F2F2F2" w:val="clear"/>
-            <w:tcMar>
-              <w:top w:type="dxa" w:w="70"/>
-              <w:left w:type="dxa" w:w="110"/>
-              <w:bottom w:type="dxa" w:w="70"/>
-              <w:right w:type="dxa" w:w="110"/>
-            </w:tcMar>
-            <w:vAlign w:val="center"/>
-          </w:tcPr>
-          <w:p>
-            <w:pPr>
-              <w:spacing w:after="0"/>
-            </w:pPr>
-            <w:r>
-              <w:rPr>
-                <w:b w:val="false"/>
-                <w:bCs w:val="false"/>
-                <w:sz w:val="17"/>
-                <w:szCs w:val="17"/>
-              </w:rPr>
-              <w:t xml:space="preserve">API do SIM do TCE-CE: contratos e contratados do município no ano, página a página, quatro municípios de cada vez</w:t>
-            </w:r>
-          </w:p>
-        </w:tc>
-        <w:tc>
-          <w:tcPr>
-            <w:tcW w:type="dxa" w:w="3900"/>
-            <w:shd w:fill="F2F2F2" w:val="clear"/>
-            <w:tcMar>
-              <w:top w:type="dxa" w:w="70"/>
-              <w:left w:type="dxa" w:w="110"/>
-              <w:bottom w:type="dxa" w:w="70"/>
-              <w:right w:type="dxa" w:w="110"/>
-            </w:tcMar>
-            <w:vAlign w:val="center"/>
-          </w:tcPr>
-          <w:p>
-            <w:pPr>
-              <w:spacing w:after="0"/>
-            </w:pPr>
-            <w:r>
-              <w:rPr>
-                <w:b w:val="false"/>
-                <w:bCs w:val="false"/>
-                <w:sz w:val="17"/>
-                <w:szCs w:val="17"/>
-              </w:rPr>
-              <w:t xml:space="preserve">Contrato com um só CNPJ vai para a empresa; com vários contratados ou nenhum, só para o total; aditivos contam sem valor (o termo traz ora o acréscimo, ora o valor total); ano com município que falhou não é gravado</w:t>
+              <w:t xml:space="preserve">Fica no panorama do Brasil e fora das linhas; em 2026, 9,8% do valor estimado, depois das estatais federais</w:t>
             </w:r>
           </w:p>
         </w:tc>
@@ -11870,7 +11458,7 @@
       </w:pPr>
       <w:bookmarkStart w:name="_Toc22" w:id="22"/>
       <w:r>
-        <w:t xml:space="preserve">4.17 pessoas_juridicas.py</w:t>
+        <w:t xml:space="preserve">4.16 tce.py, tce_rs.py, tce_pr.py, tce_pe.py e tce_ce.py</w:t>
       </w:r>
       <w:bookmarkEnd w:id="22"/>
     </w:p>
@@ -12008,6 +11596,822 @@
                 <w:sz w:val="17"/>
                 <w:szCs w:val="17"/>
               </w:rPr>
+              <w:t xml:space="preserve">tce.cabecalho, tce.ArquivoRemoto</w:t>
+            </w:r>
+          </w:p>
+        </w:tc>
+        <w:tc>
+          <w:tcPr>
+            <w:tcW w:type="dxa" w:w="3300"/>
+            <w:shd w:fill="FFFFFF" w:val="clear"/>
+            <w:tcMar>
+              <w:top w:type="dxa" w:w="70"/>
+              <w:left w:type="dxa" w:w="110"/>
+              <w:bottom w:type="dxa" w:w="70"/>
+              <w:right w:type="dxa" w:w="110"/>
+            </w:tcMar>
+            <w:vAlign w:val="center"/>
+          </w:tcPr>
+          <w:p>
+            <w:pPr>
+              <w:spacing w:after="0"/>
+            </w:pPr>
+            <w:r>
+              <w:rPr>
+                <w:b w:val="false"/>
+                <w:bCs w:val="false"/>
+                <w:sz w:val="17"/>
+                <w:szCs w:val="17"/>
+              </w:rPr>
+              <w:t xml:space="preserve">O tamanho e a etiqueta de cada arquivo e a leitura por partes (Range)</w:t>
+            </w:r>
+          </w:p>
+        </w:tc>
+        <w:tc>
+          <w:tcPr>
+            <w:tcW w:type="dxa" w:w="3900"/>
+            <w:shd w:fill="FFFFFF" w:val="clear"/>
+            <w:tcMar>
+              <w:top w:type="dxa" w:w="70"/>
+              <w:left w:type="dxa" w:w="110"/>
+              <w:bottom w:type="dxa" w:w="70"/>
+              <w:right w:type="dxa" w:w="110"/>
+            </w:tcMar>
+            <w:vAlign w:val="center"/>
+          </w:tcPr>
+          <w:p>
+            <w:pPr>
+              <w:spacing w:after="0"/>
+            </w:pPr>
+            <w:r>
+              <w:rPr>
+                <w:b w:val="false"/>
+                <w:bCs w:val="false"/>
+                <w:sz w:val="17"/>
+                <w:szCs w:val="17"/>
+              </w:rPr>
+              <w:t xml:space="preserve">Cada ZIP anual do TCE-RS repete a tabela de pessoas (80 MB); lendo por partes, cada ano custa uns 5 MB</w:t>
+            </w:r>
+          </w:p>
+        </w:tc>
+      </w:tr>
+      <w:tr>
+        <w:trPr>
+          <w:cantSplit/>
+        </w:trPr>
+        <w:tc>
+          <w:tcPr>
+            <w:tcW w:type="dxa" w:w="2400"/>
+            <w:shd w:fill="F2F2F2" w:val="clear"/>
+            <w:tcMar>
+              <w:top w:type="dxa" w:w="70"/>
+              <w:left w:type="dxa" w:w="110"/>
+              <w:bottom w:type="dxa" w:w="70"/>
+              <w:right w:type="dxa" w:w="110"/>
+            </w:tcMar>
+            <w:vAlign w:val="center"/>
+          </w:tcPr>
+          <w:p>
+            <w:pPr>
+              <w:spacing w:after="0"/>
+            </w:pPr>
+            <w:r>
+              <w:rPr>
+                <w:rFonts w:ascii="Consolas" w:cs="Consolas" w:eastAsia="Consolas" w:hAnsi="Consolas"/>
+                <w:b w:val="false"/>
+                <w:bCs w:val="false"/>
+                <w:sz w:val="17"/>
+                <w:szCs w:val="17"/>
+              </w:rPr>
+              <w:t xml:space="preserve">tce.SomaAno</w:t>
+            </w:r>
+          </w:p>
+        </w:tc>
+        <w:tc>
+          <w:tcPr>
+            <w:tcW w:type="dxa" w:w="3300"/>
+            <w:shd w:fill="F2F2F2" w:val="clear"/>
+            <w:tcMar>
+              <w:top w:type="dxa" w:w="70"/>
+              <w:left w:type="dxa" w:w="110"/>
+              <w:bottom w:type="dxa" w:w="70"/>
+              <w:right w:type="dxa" w:w="110"/>
+            </w:tcMar>
+            <w:vAlign w:val="center"/>
+          </w:tcPr>
+          <w:p>
+            <w:pPr>
+              <w:spacing w:after="0"/>
+            </w:pPr>
+            <w:r>
+              <w:rPr>
+                <w:b w:val="false"/>
+                <w:bCs w:val="false"/>
+                <w:sz w:val="17"/>
+                <w:szCs w:val="17"/>
+              </w:rPr>
+              <w:t xml:space="preserve">A soma de um ano por ente (contratos, valor, fora do teto, pessoa física, aditivos) e por CNPJ</w:t>
+            </w:r>
+          </w:p>
+        </w:tc>
+        <w:tc>
+          <w:tcPr>
+            <w:tcW w:type="dxa" w:w="3900"/>
+            <w:shd w:fill="F2F2F2" w:val="clear"/>
+            <w:tcMar>
+              <w:top w:type="dxa" w:w="70"/>
+              <w:left w:type="dxa" w:w="110"/>
+              <w:bottom w:type="dxa" w:w="70"/>
+              <w:right w:type="dxa" w:w="110"/>
+            </w:tcMar>
+            <w:vAlign w:val="center"/>
+          </w:tcPr>
+          <w:p>
+            <w:pPr>
+              <w:spacing w:after="0"/>
+            </w:pPr>
+            <w:r>
+              <w:rPr>
+                <w:b w:val="false"/>
+                <w:bCs w:val="false"/>
+                <w:sz w:val="17"/>
+                <w:szCs w:val="17"/>
+              </w:rPr>
+              <w:t xml:space="preserve">Mesmo teto de plausibilidade do PNCP; o CPF nunca é guardado</w:t>
+            </w:r>
+          </w:p>
+        </w:tc>
+      </w:tr>
+      <w:tr>
+        <w:trPr>
+          <w:cantSplit/>
+        </w:trPr>
+        <w:tc>
+          <w:tcPr>
+            <w:tcW w:type="dxa" w:w="2400"/>
+            <w:shd w:fill="FFFFFF" w:val="clear"/>
+            <w:tcMar>
+              <w:top w:type="dxa" w:w="70"/>
+              <w:left w:type="dxa" w:w="110"/>
+              <w:bottom w:type="dxa" w:w="70"/>
+              <w:right w:type="dxa" w:w="110"/>
+            </w:tcMar>
+            <w:vAlign w:val="center"/>
+          </w:tcPr>
+          <w:p>
+            <w:pPr>
+              <w:spacing w:after="0"/>
+            </w:pPr>
+            <w:r>
+              <w:rPr>
+                <w:rFonts w:ascii="Consolas" w:cs="Consolas" w:eastAsia="Consolas" w:hAnsi="Consolas"/>
+                <w:b w:val="false"/>
+                <w:bCs w:val="false"/>
+                <w:sz w:val="17"/>
+                <w:szCs w:val="17"/>
+              </w:rPr>
+              <w:t xml:space="preserve">tce.precisa_ler</w:t>
+            </w:r>
+          </w:p>
+        </w:tc>
+        <w:tc>
+          <w:tcPr>
+            <w:tcW w:type="dxa" w:w="3300"/>
+            <w:shd w:fill="FFFFFF" w:val="clear"/>
+            <w:tcMar>
+              <w:top w:type="dxa" w:w="70"/>
+              <w:left w:type="dxa" w:w="110"/>
+              <w:bottom w:type="dxa" w:w="70"/>
+              <w:right w:type="dxa" w:w="110"/>
+            </w:tcMar>
+            <w:vAlign w:val="center"/>
+          </w:tcPr>
+          <w:p>
+            <w:pPr>
+              <w:spacing w:after="0"/>
+            </w:pPr>
+            <w:r>
+              <w:rPr>
+                <w:b w:val="false"/>
+                <w:bCs w:val="false"/>
+                <w:sz w:val="17"/>
+                <w:szCs w:val="17"/>
+              </w:rPr>
+              <w:t xml:space="preserve">Se o ano tem de ser lido de novo</w:t>
+            </w:r>
+          </w:p>
+        </w:tc>
+        <w:tc>
+          <w:tcPr>
+            <w:tcW w:type="dxa" w:w="3900"/>
+            <w:shd w:fill="FFFFFF" w:val="clear"/>
+            <w:tcMar>
+              <w:top w:type="dxa" w:w="70"/>
+              <w:left w:type="dxa" w:w="110"/>
+              <w:bottom w:type="dxa" w:w="70"/>
+              <w:right w:type="dxa" w:w="110"/>
+            </w:tcMar>
+            <w:vAlign w:val="center"/>
+          </w:tcPr>
+          <w:p>
+            <w:pPr>
+              <w:spacing w:after="0"/>
+            </w:pPr>
+            <w:r>
+              <w:rPr>
+                <w:b w:val="false"/>
+                <w:bCs w:val="false"/>
+                <w:sz w:val="17"/>
+                <w:szCs w:val="17"/>
+              </w:rPr>
+              <w:t xml:space="preserve">Ano fechado só quando muda de tamanho; o corrente e o anterior, uma vez por semana</w:t>
+            </w:r>
+          </w:p>
+        </w:tc>
+      </w:tr>
+      <w:tr>
+        <w:trPr>
+          <w:cantSplit/>
+        </w:trPr>
+        <w:tc>
+          <w:tcPr>
+            <w:tcW w:type="dxa" w:w="2400"/>
+            <w:shd w:fill="F2F2F2" w:val="clear"/>
+            <w:tcMar>
+              <w:top w:type="dxa" w:w="70"/>
+              <w:left w:type="dxa" w:w="110"/>
+              <w:bottom w:type="dxa" w:w="70"/>
+              <w:right w:type="dxa" w:w="110"/>
+            </w:tcMar>
+            <w:vAlign w:val="center"/>
+          </w:tcPr>
+          <w:p>
+            <w:pPr>
+              <w:spacing w:after="0"/>
+            </w:pPr>
+            <w:r>
+              <w:rPr>
+                <w:rFonts w:ascii="Consolas" w:cs="Consolas" w:eastAsia="Consolas" w:hAnsi="Consolas"/>
+                <w:b w:val="false"/>
+                <w:bCs w:val="false"/>
+                <w:sz w:val="17"/>
+                <w:szCs w:val="17"/>
+              </w:rPr>
+              <w:t xml:space="preserve">tce.publicar</w:t>
+            </w:r>
+          </w:p>
+        </w:tc>
+        <w:tc>
+          <w:tcPr>
+            <w:tcW w:type="dxa" w:w="3300"/>
+            <w:shd w:fill="F2F2F2" w:val="clear"/>
+            <w:tcMar>
+              <w:top w:type="dxa" w:w="70"/>
+              <w:left w:type="dxa" w:w="110"/>
+              <w:bottom w:type="dxa" w:w="70"/>
+              <w:right w:type="dxa" w:w="110"/>
+            </w:tcMar>
+            <w:vAlign w:val="center"/>
+          </w:tcPr>
+          <w:p>
+            <w:pPr>
+              <w:spacing w:after="0"/>
+            </w:pPr>
+            <w:r>
+              <w:rPr>
+                <w:b w:val="false"/>
+                <w:bCs w:val="false"/>
+                <w:sz w:val="17"/>
+                <w:szCs w:val="17"/>
+              </w:rPr>
+              <w:t xml:space="preserve">tce/ente/&lt;grupo&gt;.json.gz: por ente, o tribunal, os anos e os 100 maiores fornecedores</w:t>
+            </w:r>
+          </w:p>
+        </w:tc>
+        <w:tc>
+          <w:tcPr>
+            <w:tcW w:type="dxa" w:w="3900"/>
+            <w:shd w:fill="F2F2F2" w:val="clear"/>
+            <w:tcMar>
+              <w:top w:type="dxa" w:w="70"/>
+              <w:left w:type="dxa" w:w="110"/>
+              <w:bottom w:type="dxa" w:w="70"/>
+              <w:right w:type="dxa" w:w="110"/>
+            </w:tcMar>
+            <w:vAlign w:val="center"/>
+          </w:tcPr>
+          <w:p>
+            <w:pPr>
+              <w:spacing w:after="0"/>
+            </w:pPr>
+            <w:r>
+              <w:rPr>
+                <w:b w:val="false"/>
+                <w:bCs w:val="false"/>
+                <w:sz w:val="17"/>
+                <w:szCs w:val="17"/>
+              </w:rPr>
+              <w:t xml:space="preserve">Junta os tribunais; lido no mandato aberto de Governos municipais; não se soma ao PNCP (ADR-050)</w:t>
+            </w:r>
+          </w:p>
+        </w:tc>
+      </w:tr>
+      <w:tr>
+        <w:trPr>
+          <w:cantSplit/>
+        </w:trPr>
+        <w:tc>
+          <w:tcPr>
+            <w:tcW w:type="dxa" w:w="2400"/>
+            <w:shd w:fill="FFFFFF" w:val="clear"/>
+            <w:tcMar>
+              <w:top w:type="dxa" w:w="70"/>
+              <w:left w:type="dxa" w:w="110"/>
+              <w:bottom w:type="dxa" w:w="70"/>
+              <w:right w:type="dxa" w:w="110"/>
+            </w:tcMar>
+            <w:vAlign w:val="center"/>
+          </w:tcPr>
+          <w:p>
+            <w:pPr>
+              <w:spacing w:after="0"/>
+            </w:pPr>
+            <w:r>
+              <w:rPr>
+                <w:rFonts w:ascii="Consolas" w:cs="Consolas" w:eastAsia="Consolas" w:hAnsi="Consolas"/>
+                <w:b w:val="false"/>
+                <w:bCs w:val="false"/>
+                <w:sz w:val="17"/>
+                <w:szCs w:val="17"/>
+              </w:rPr>
+              <w:t xml:space="preserve">tce_rs.ler_orgaos, ler_ano, ler_nomes, coletar</w:t>
+            </w:r>
+          </w:p>
+        </w:tc>
+        <w:tc>
+          <w:tcPr>
+            <w:tcW w:type="dxa" w:w="3300"/>
+            <w:shd w:fill="FFFFFF" w:val="clear"/>
+            <w:tcMar>
+              <w:top w:type="dxa" w:w="70"/>
+              <w:left w:type="dxa" w:w="110"/>
+              <w:bottom w:type="dxa" w:w="70"/>
+              <w:right w:type="dxa" w:w="110"/>
+            </w:tcMar>
+            <w:vAlign w:val="center"/>
+          </w:tcPr>
+          <w:p>
+            <w:pPr>
+              <w:spacing w:after="0"/>
+            </w:pPr>
+            <w:r>
+              <w:rPr>
+                <w:b w:val="false"/>
+                <w:bCs w:val="false"/>
+                <w:sz w:val="17"/>
+                <w:szCs w:val="17"/>
+              </w:rPr>
+              <w:t xml:space="preserve">LicitaCon: órgão no ente, contratos e aditivos do ano, nomes das empresas</w:t>
+            </w:r>
+          </w:p>
+        </w:tc>
+        <w:tc>
+          <w:tcPr>
+            <w:tcW w:type="dxa" w:w="3900"/>
+            <w:shd w:fill="FFFFFF" w:val="clear"/>
+            <w:tcMar>
+              <w:top w:type="dxa" w:w="70"/>
+              <w:left w:type="dxa" w:w="110"/>
+              <w:bottom w:type="dxa" w:w="70"/>
+              <w:right w:type="dxa" w:w="110"/>
+            </w:tcMar>
+            <w:vAlign w:val="center"/>
+          </w:tcPr>
+          <w:p>
+            <w:pPr>
+              <w:spacing w:after="0"/>
+            </w:pPr>
+            <w:r>
+              <w:rPr>
+                <w:b w:val="false"/>
+                <w:bCs w:val="false"/>
+                <w:sz w:val="17"/>
+                <w:szCs w:val="17"/>
+              </w:rPr>
+              <w:t xml:space="preserve">Consórcios e associações sem ente; o nome do MEI sai mascarado</w:t>
+            </w:r>
+          </w:p>
+        </w:tc>
+      </w:tr>
+      <w:tr>
+        <w:trPr>
+          <w:cantSplit/>
+        </w:trPr>
+        <w:tc>
+          <w:tcPr>
+            <w:tcW w:type="dxa" w:w="2400"/>
+            <w:shd w:fill="F2F2F2" w:val="clear"/>
+            <w:tcMar>
+              <w:top w:type="dxa" w:w="70"/>
+              <w:left w:type="dxa" w:w="110"/>
+              <w:bottom w:type="dxa" w:w="70"/>
+              <w:right w:type="dxa" w:w="110"/>
+            </w:tcMar>
+            <w:vAlign w:val="center"/>
+          </w:tcPr>
+          <w:p>
+            <w:pPr>
+              <w:spacing w:after="0"/>
+            </w:pPr>
+            <w:r>
+              <w:rPr>
+                <w:rFonts w:ascii="Consolas" w:cs="Consolas" w:eastAsia="Consolas" w:hAnsi="Consolas"/>
+                <w:b w:val="false"/>
+                <w:bCs w:val="false"/>
+                <w:sz w:val="17"/>
+                <w:szCs w:val="17"/>
+              </w:rPr>
+              <w:t xml:space="preserve">tce_pr.ler_municipio, coletar</w:t>
+            </w:r>
+          </w:p>
+        </w:tc>
+        <w:tc>
+          <w:tcPr>
+            <w:tcW w:type="dxa" w:w="3300"/>
+            <w:shd w:fill="F2F2F2" w:val="clear"/>
+            <w:tcMar>
+              <w:top w:type="dxa" w:w="70"/>
+              <w:left w:type="dxa" w:w="110"/>
+              <w:bottom w:type="dxa" w:w="70"/>
+              <w:right w:type="dxa" w:w="110"/>
+            </w:tcMar>
+            <w:vAlign w:val="center"/>
+          </w:tcPr>
+          <w:p>
+            <w:pPr>
+              <w:spacing w:after="0"/>
+            </w:pPr>
+            <w:r>
+              <w:rPr>
+                <w:b w:val="false"/>
+                <w:bCs w:val="false"/>
+                <w:sz w:val="17"/>
+                <w:szCs w:val="17"/>
+              </w:rPr>
+              <w:t xml:space="preserve">SIM-AM: o ZIP de cada município no ano, com os contratos por contratado e os aditivos do ano</w:t>
+            </w:r>
+          </w:p>
+        </w:tc>
+        <w:tc>
+          <w:tcPr>
+            <w:tcW w:type="dxa" w:w="3900"/>
+            <w:shd w:fill="F2F2F2" w:val="clear"/>
+            <w:tcMar>
+              <w:top w:type="dxa" w:w="70"/>
+              <w:left w:type="dxa" w:w="110"/>
+              <w:bottom w:type="dxa" w:w="70"/>
+              <w:right w:type="dxa" w:w="110"/>
+            </w:tcMar>
+            <w:vAlign w:val="center"/>
+          </w:tcPr>
+          <w:p>
+            <w:pPr>
+              <w:spacing w:after="0"/>
+            </w:pPr>
+            <w:r>
+              <w:rPr>
+                <w:b w:val="false"/>
+                <w:bCs w:val="false"/>
+                <w:sz w:val="17"/>
+                <w:szCs w:val="17"/>
+              </w:rPr>
+              <w:t xml:space="preserve">O ZIP do estado só sinaliza mudança; consórcio sem ente; supressão entra negativa</w:t>
+            </w:r>
+          </w:p>
+        </w:tc>
+      </w:tr>
+      <w:tr>
+        <w:trPr>
+          <w:cantSplit/>
+        </w:trPr>
+        <w:tc>
+          <w:tcPr>
+            <w:tcW w:type="dxa" w:w="2400"/>
+            <w:shd w:fill="FFFFFF" w:val="clear"/>
+            <w:tcMar>
+              <w:top w:type="dxa" w:w="70"/>
+              <w:left w:type="dxa" w:w="110"/>
+              <w:bottom w:type="dxa" w:w="70"/>
+              <w:right w:type="dxa" w:w="110"/>
+            </w:tcMar>
+            <w:vAlign w:val="center"/>
+          </w:tcPr>
+          <w:p>
+            <w:pPr>
+              <w:spacing w:after="0"/>
+            </w:pPr>
+            <w:r>
+              <w:rPr>
+                <w:rFonts w:ascii="Consolas" w:cs="Consolas" w:eastAsia="Consolas" w:hAnsi="Consolas"/>
+                <w:b w:val="false"/>
+                <w:bCs w:val="false"/>
+                <w:sz w:val="17"/>
+                <w:szCs w:val="17"/>
+              </w:rPr>
+              <w:t xml:space="preserve">tce_pe.consultar, somar_ano, coletar</w:t>
+            </w:r>
+          </w:p>
+        </w:tc>
+        <w:tc>
+          <w:tcPr>
+            <w:tcW w:type="dxa" w:w="3300"/>
+            <w:shd w:fill="FFFFFF" w:val="clear"/>
+            <w:tcMar>
+              <w:top w:type="dxa" w:w="70"/>
+              <w:left w:type="dxa" w:w="110"/>
+              <w:bottom w:type="dxa" w:w="70"/>
+              <w:right w:type="dxa" w:w="110"/>
+            </w:tcMar>
+            <w:vAlign w:val="center"/>
+          </w:tcPr>
+          <w:p>
+            <w:pPr>
+              <w:spacing w:after="0"/>
+            </w:pPr>
+            <w:r>
+              <w:rPr>
+                <w:b w:val="false"/>
+                <w:bCs w:val="false"/>
+                <w:sz w:val="17"/>
+                <w:szCs w:val="17"/>
+              </w:rPr>
+              <w:t xml:space="preserve">API do TCE-PE: contratos e aditivos do ano, município pelo nome</w:t>
+            </w:r>
+          </w:p>
+        </w:tc>
+        <w:tc>
+          <w:tcPr>
+            <w:tcW w:type="dxa" w:w="3900"/>
+            <w:shd w:fill="FFFFFF" w:val="clear"/>
+            <w:tcMar>
+              <w:top w:type="dxa" w:w="70"/>
+              <w:left w:type="dxa" w:w="110"/>
+              <w:bottom w:type="dxa" w:w="70"/>
+              <w:right w:type="dxa" w:w="110"/>
+            </w:tcMar>
+            <w:vAlign w:val="center"/>
+          </w:tcPr>
+          <w:p>
+            <w:pPr>
+              <w:spacing w:after="0"/>
+            </w:pPr>
+            <w:r>
+              <w:rPr>
+                <w:b w:val="false"/>
+                <w:bCs w:val="false"/>
+                <w:sz w:val="17"/>
+                <w:szCs w:val="17"/>
+              </w:rPr>
+              <w:t xml:space="preserve">Sem cabeçalho de mudança: ano fechado relido uma vez por mês (tce.precisa_ler_por_idade); consulta cortada vai para os problemas</w:t>
+            </w:r>
+          </w:p>
+        </w:tc>
+      </w:tr>
+      <w:tr>
+        <w:trPr>
+          <w:cantSplit/>
+        </w:trPr>
+        <w:tc>
+          <w:tcPr>
+            <w:tcW w:type="dxa" w:w="2400"/>
+            <w:shd w:fill="F2F2F2" w:val="clear"/>
+            <w:tcMar>
+              <w:top w:type="dxa" w:w="70"/>
+              <w:left w:type="dxa" w:w="110"/>
+              <w:bottom w:type="dxa" w:w="70"/>
+              <w:right w:type="dxa" w:w="110"/>
+            </w:tcMar>
+            <w:vAlign w:val="center"/>
+          </w:tcPr>
+          <w:p>
+            <w:pPr>
+              <w:spacing w:after="0"/>
+            </w:pPr>
+            <w:r>
+              <w:rPr>
+                <w:rFonts w:ascii="Consolas" w:cs="Consolas" w:eastAsia="Consolas" w:hAnsi="Consolas"/>
+                <w:b w:val="false"/>
+                <w:bCs w:val="false"/>
+                <w:sz w:val="17"/>
+                <w:szCs w:val="17"/>
+              </w:rPr>
+              <w:t xml:space="preserve">tce_ce.consultar, ler_municipio, somar_ano, coletar</w:t>
+            </w:r>
+          </w:p>
+        </w:tc>
+        <w:tc>
+          <w:tcPr>
+            <w:tcW w:type="dxa" w:w="3300"/>
+            <w:shd w:fill="F2F2F2" w:val="clear"/>
+            <w:tcMar>
+              <w:top w:type="dxa" w:w="70"/>
+              <w:left w:type="dxa" w:w="110"/>
+              <w:bottom w:type="dxa" w:w="70"/>
+              <w:right w:type="dxa" w:w="110"/>
+            </w:tcMar>
+            <w:vAlign w:val="center"/>
+          </w:tcPr>
+          <w:p>
+            <w:pPr>
+              <w:spacing w:after="0"/>
+            </w:pPr>
+            <w:r>
+              <w:rPr>
+                <w:b w:val="false"/>
+                <w:bCs w:val="false"/>
+                <w:sz w:val="17"/>
+                <w:szCs w:val="17"/>
+              </w:rPr>
+              <w:t xml:space="preserve">API do SIM do TCE-CE: contratos e contratados do município no ano, página a página, quatro municípios de cada vez</w:t>
+            </w:r>
+          </w:p>
+        </w:tc>
+        <w:tc>
+          <w:tcPr>
+            <w:tcW w:type="dxa" w:w="3900"/>
+            <w:shd w:fill="F2F2F2" w:val="clear"/>
+            <w:tcMar>
+              <w:top w:type="dxa" w:w="70"/>
+              <w:left w:type="dxa" w:w="110"/>
+              <w:bottom w:type="dxa" w:w="70"/>
+              <w:right w:type="dxa" w:w="110"/>
+            </w:tcMar>
+            <w:vAlign w:val="center"/>
+          </w:tcPr>
+          <w:p>
+            <w:pPr>
+              <w:spacing w:after="0"/>
+            </w:pPr>
+            <w:r>
+              <w:rPr>
+                <w:b w:val="false"/>
+                <w:bCs w:val="false"/>
+                <w:sz w:val="17"/>
+                <w:szCs w:val="17"/>
+              </w:rPr>
+              <w:t xml:space="preserve">Contrato com um só CNPJ vai para a empresa; com vários contratados ou nenhum, só para o total; aditivos contam sem valor (o termo traz ora o acréscimo, ora o valor total); ano com município que falhou não é gravado</w:t>
+            </w:r>
+          </w:p>
+        </w:tc>
+      </w:tr>
+    </w:tbl>
+    <w:p>
+      <w:pPr>
+        <w:pStyle w:val="Heading2"/>
+        <w:keepNext/>
+        <w:keepLines/>
+        <w:spacing w:after="120" w:before="280"/>
+      </w:pPr>
+      <w:bookmarkStart w:name="_Toc23" w:id="23"/>
+      <w:r>
+        <w:t xml:space="preserve">4.17 pessoas_juridicas.py</w:t>
+      </w:r>
+      <w:bookmarkEnd w:id="23"/>
+    </w:p>
+    <w:tbl>
+      <w:tblPr>
+        <w:tblW w:type="dxa" w:w="9600"/>
+        <w:tblBorders>
+          <w:top w:val="single" w:color="BFBFBF" w:sz="4"/>
+          <w:left w:val="single" w:color="BFBFBF" w:sz="4"/>
+          <w:bottom w:val="single" w:color="BFBFBF" w:sz="4"/>
+          <w:right w:val="single" w:color="BFBFBF" w:sz="4"/>
+          <w:insideH w:val="single" w:color="D9D9D9" w:sz="2"/>
+          <w:insideV w:val="single" w:color="D9D9D9" w:sz="2"/>
+        </w:tblBorders>
+      </w:tblPr>
+      <w:tblGrid>
+        <w:gridCol w:w="2400"/>
+        <w:gridCol w:w="3300"/>
+        <w:gridCol w:w="3900"/>
+      </w:tblGrid>
+      <w:tr>
+        <w:trPr>
+          <w:tblHeader/>
+        </w:trPr>
+        <w:tc>
+          <w:tcPr>
+            <w:tcW w:type="dxa" w:w="2400"/>
+            <w:shd w:fill="1F3864" w:val="clear"/>
+            <w:tcMar>
+              <w:top w:type="dxa" w:w="80"/>
+              <w:left w:type="dxa" w:w="110"/>
+              <w:bottom w:type="dxa" w:w="80"/>
+              <w:right w:type="dxa" w:w="110"/>
+            </w:tcMar>
+            <w:vAlign w:val="center"/>
+          </w:tcPr>
+          <w:p>
+            <w:pPr>
+              <w:spacing w:after="0"/>
+            </w:pPr>
+            <w:r>
+              <w:rPr>
+                <w:b/>
+                <w:bCs/>
+                <w:color w:val="FFFFFF"/>
+                <w:sz w:val="19"/>
+                <w:szCs w:val="19"/>
+              </w:rPr>
+              <w:t xml:space="preserve">Nome</w:t>
+            </w:r>
+          </w:p>
+        </w:tc>
+        <w:tc>
+          <w:tcPr>
+            <w:tcW w:type="dxa" w:w="3300"/>
+            <w:shd w:fill="1F3864" w:val="clear"/>
+            <w:tcMar>
+              <w:top w:type="dxa" w:w="80"/>
+              <w:left w:type="dxa" w:w="110"/>
+              <w:bottom w:type="dxa" w:w="80"/>
+              <w:right w:type="dxa" w:w="110"/>
+            </w:tcMar>
+            <w:vAlign w:val="center"/>
+          </w:tcPr>
+          <w:p>
+            <w:pPr>
+              <w:spacing w:after="0"/>
+            </w:pPr>
+            <w:r>
+              <w:rPr>
+                <w:b/>
+                <w:bCs/>
+                <w:color w:val="FFFFFF"/>
+                <w:sz w:val="19"/>
+                <w:szCs w:val="19"/>
+              </w:rPr>
+              <w:t xml:space="preserve">O que faz</w:t>
+            </w:r>
+          </w:p>
+        </w:tc>
+        <w:tc>
+          <w:tcPr>
+            <w:tcW w:type="dxa" w:w="3900"/>
+            <w:shd w:fill="1F3864" w:val="clear"/>
+            <w:tcMar>
+              <w:top w:type="dxa" w:w="80"/>
+              <w:left w:type="dxa" w:w="110"/>
+              <w:bottom w:type="dxa" w:w="80"/>
+              <w:right w:type="dxa" w:w="110"/>
+            </w:tcMar>
+            <w:vAlign w:val="center"/>
+          </w:tcPr>
+          <w:p>
+            <w:pPr>
+              <w:spacing w:after="0"/>
+            </w:pPr>
+            <w:r>
+              <w:rPr>
+                <w:b/>
+                <w:bCs/>
+                <w:color w:val="FFFFFF"/>
+                <w:sz w:val="19"/>
+                <w:szCs w:val="19"/>
+              </w:rPr>
+              <w:t xml:space="preserve">Como e por quê</w:t>
+            </w:r>
+          </w:p>
+        </w:tc>
+      </w:tr>
+      <w:tr>
+        <w:trPr>
+          <w:cantSplit/>
+        </w:trPr>
+        <w:tc>
+          <w:tcPr>
+            <w:tcW w:type="dxa" w:w="2400"/>
+            <w:shd w:fill="FFFFFF" w:val="clear"/>
+            <w:tcMar>
+              <w:top w:type="dxa" w:w="70"/>
+              <w:left w:type="dxa" w:w="110"/>
+              <w:bottom w:type="dxa" w:w="70"/>
+              <w:right w:type="dxa" w:w="110"/>
+            </w:tcMar>
+            <w:vAlign w:val="center"/>
+          </w:tcPr>
+          <w:p>
+            <w:pPr>
+              <w:spacing w:after="0"/>
+            </w:pPr>
+            <w:r>
+              <w:rPr>
+                <w:rFonts w:ascii="Consolas" w:cs="Consolas" w:eastAsia="Consolas" w:hAnsi="Consolas"/>
+                <w:b w:val="false"/>
+                <w:bCs w:val="false"/>
+                <w:sz w:val="17"/>
+                <w:szCs w:val="17"/>
+              </w:rPr>
               <w:t xml:space="preserve">de_contratacoes</w:t>
             </w:r>
           </w:p>
@@ -12336,11 +12740,11 @@
         <w:keepLines/>
         <w:spacing w:after="160" w:before="380"/>
       </w:pPr>
-      <w:bookmarkStart w:name="_Toc23" w:id="23"/>
+      <w:bookmarkStart w:name="_Toc24" w:id="24"/>
       <w:r>
         <w:t xml:space="preserve">5. Estado guardado entre execuções</w:t>
       </w:r>
-      <w:bookmarkEnd w:id="23"/>
+      <w:bookmarkEnd w:id="24"/>
     </w:p>
     <w:p>
       <w:pPr>
@@ -12941,7 +13345,7 @@
                 <w:sz w:val="17"/>
                 <w:szCs w:val="17"/>
               </w:rPr>
-              <w:t xml:space="preserve">emendas.json.gz</w:t>
+              <w:t xml:space="preserve">recebimentos.json.gz</w:t>
             </w:r>
           </w:p>
         </w:tc>
@@ -12968,7 +13372,7 @@
                 <w:sz w:val="17"/>
                 <w:szCs w:val="17"/>
               </w:rPr>
-              <w:t xml:space="preserve">Emendas parlamentares recebidas por ente (ADR-044), com a data do arquivo da CGU</w:t>
+              <w:t xml:space="preserve">Recebido da União por CNPJ (ADR-058): os meses fixados somados por ano e os três recentes à parte</w:t>
             </w:r>
           </w:p>
         </w:tc>
@@ -12995,7 +13399,7 @@
                 <w:sz w:val="17"/>
                 <w:szCs w:val="17"/>
               </w:rPr>
-              <w:t xml:space="preserve">recebido (por código IBGE: ano, emenda, categoria, cnpj, favorecido, valor), emendas (ano, tipo, autor, número, função, ação), sem_lugar</w:t>
+              <w:t xml:space="preserve">anos e recentes (cnpjs: por CNPJ e órgão superior, o valor; fora: linhas e valor sem CNPJ), fixados, nomes, orgaos</w:t>
             </w:r>
           </w:p>
         </w:tc>
@@ -13028,7 +13432,7 @@
                 <w:sz w:val="17"/>
                 <w:szCs w:val="17"/>
               </w:rPr>
-              <w:t xml:space="preserve">cnpj-fornecedores.json.gz</w:t>
+              <w:t xml:space="preserve">emendas.json.gz</w:t>
             </w:r>
           </w:p>
         </w:tc>
@@ -13055,7 +13459,7 @@
                 <w:sz w:val="17"/>
                 <w:szCs w:val="17"/>
               </w:rPr>
-              <w:t xml:space="preserve">Base de CNPJ da Receita dos fornecedores (ADR-043): empresa, estabelecimento, Simples e sócios, com o mês e as tabelas de código usadas</w:t>
+              <w:t xml:space="preserve">Emendas parlamentares recebidas por ente (ADR-044), com a data do arquivo da CGU</w:t>
             </w:r>
           </w:p>
         </w:tc>
@@ -13082,7 +13486,7 @@
                 <w:sz w:val="17"/>
                 <w:szCs w:val="17"/>
               </w:rPr>
-              <w:t xml:space="preserve">por CNPJ: empresa, estabelecimento, simples, socios; pedidos (os CNPJs procurados)</w:t>
+              <w:t xml:space="preserve">recebido (por código IBGE: ano, emenda, categoria, cnpj, favorecido, valor), emendas (ano, tipo, autor, número, função, ação), sem_lugar</w:t>
             </w:r>
           </w:p>
         </w:tc>
@@ -13115,7 +13519,7 @@
                 <w:sz w:val="17"/>
                 <w:szCs w:val="17"/>
               </w:rPr>
-              <w:t xml:space="preserve">pessoal-UF.json.gz</w:t>
+              <w:t xml:space="preserve">cnpj-fornecedores.json.gz</w:t>
             </w:r>
           </w:p>
         </w:tc>
@@ -13142,7 +13546,7 @@
                 <w:sz w:val="17"/>
                 <w:szCs w:val="17"/>
               </w:rPr>
-              <w:t xml:space="preserve">Despesa com pessoal do Executivo de cada ente da UF no último período do exercício anterior (RGF, Anexo 1), ou a data da última tentativa sem dado</w:t>
+              <w:t xml:space="preserve">Base de CNPJ da Receita dos fornecedores (ADR-043): empresa, estabelecimento, Simples e sócios, com o mês e as tabelas de código usadas</w:t>
             </w:r>
           </w:p>
         </w:tc>
@@ -13169,7 +13573,7 @@
                 <w:sz w:val="17"/>
                 <w:szCs w:val="17"/>
               </w:rPr>
-              <w:t xml:space="preserve">por ente: percentual, dtp, rcl_ajustada, limites (alerta, prudencial, maximo), demonstrativo, periodo, periodicidade, coletado_em ou tentado_em</w:t>
+              <w:t xml:space="preserve">por CNPJ: empresa, estabelecimento, simples, socios; pedidos (os CNPJs procurados)</w:t>
             </w:r>
           </w:p>
         </w:tc>
@@ -13202,6 +13606,93 @@
                 <w:sz w:val="17"/>
                 <w:szCs w:val="17"/>
               </w:rPr>
+              <w:t xml:space="preserve">pessoal-UF.json.gz</w:t>
+            </w:r>
+          </w:p>
+        </w:tc>
+        <w:tc>
+          <w:tcPr>
+            <w:tcW w:type="dxa" w:w="3000"/>
+            <w:shd w:fill="FFFFFF" w:val="clear"/>
+            <w:tcMar>
+              <w:top w:type="dxa" w:w="70"/>
+              <w:left w:type="dxa" w:w="110"/>
+              <w:bottom w:type="dxa" w:w="70"/>
+              <w:right w:type="dxa" w:w="110"/>
+            </w:tcMar>
+            <w:vAlign w:val="center"/>
+          </w:tcPr>
+          <w:p>
+            <w:pPr>
+              <w:spacing w:after="0"/>
+            </w:pPr>
+            <w:r>
+              <w:rPr>
+                <w:b w:val="false"/>
+                <w:bCs w:val="false"/>
+                <w:sz w:val="17"/>
+                <w:szCs w:val="17"/>
+              </w:rPr>
+              <w:t xml:space="preserve">Despesa com pessoal do Executivo de cada ente da UF no último período do exercício anterior (RGF, Anexo 1), ou a data da última tentativa sem dado</w:t>
+            </w:r>
+          </w:p>
+        </w:tc>
+        <w:tc>
+          <w:tcPr>
+            <w:tcW w:type="dxa" w:w="3800"/>
+            <w:shd w:fill="FFFFFF" w:val="clear"/>
+            <w:tcMar>
+              <w:top w:type="dxa" w:w="70"/>
+              <w:left w:type="dxa" w:w="110"/>
+              <w:bottom w:type="dxa" w:w="70"/>
+              <w:right w:type="dxa" w:w="110"/>
+            </w:tcMar>
+            <w:vAlign w:val="center"/>
+          </w:tcPr>
+          <w:p>
+            <w:pPr>
+              <w:spacing w:after="0"/>
+            </w:pPr>
+            <w:r>
+              <w:rPr>
+                <w:b w:val="false"/>
+                <w:bCs w:val="false"/>
+                <w:sz w:val="17"/>
+                <w:szCs w:val="17"/>
+              </w:rPr>
+              <w:t xml:space="preserve">por ente: percentual, dtp, rcl_ajustada, limites (alerta, prudencial, maximo), demonstrativo, periodo, periodicidade, coletado_em ou tentado_em</w:t>
+            </w:r>
+          </w:p>
+        </w:tc>
+      </w:tr>
+      <w:tr>
+        <w:trPr>
+          <w:cantSplit/>
+        </w:trPr>
+        <w:tc>
+          <w:tcPr>
+            <w:tcW w:type="dxa" w:w="2800"/>
+            <w:shd w:fill="F2F2F2" w:val="clear"/>
+            <w:tcMar>
+              <w:top w:type="dxa" w:w="70"/>
+              <w:left w:type="dxa" w:w="110"/>
+              <w:bottom w:type="dxa" w:w="70"/>
+              <w:right w:type="dxa" w:w="110"/>
+            </w:tcMar>
+            <w:vAlign w:val="center"/>
+          </w:tcPr>
+          <w:p>
+            <w:pPr>
+              <w:spacing w:after="0"/>
+            </w:pPr>
+            <w:r>
+              <w:rPr>
+                <w:rFonts w:ascii="Consolas" w:cs="Consolas" w:eastAsia="Consolas" w:hAnsi="Consolas"/>
+                <w:b w:val="false"/>
+                <w:bCs w:val="false"/>
+                <w:sz w:val="17"/>
+                <w:szCs w:val="17"/>
+              </w:rPr>
               <w:t xml:space="preserve">despesa-funcao-UF.json.gz</w:t>
             </w:r>
           </w:p>
@@ -13209,7 +13700,7 @@
         <w:tc>
           <w:tcPr>
             <w:tcW w:type="dxa" w:w="3000"/>
-            <w:shd w:fill="FFFFFF" w:val="clear"/>
+            <w:shd w:fill="F2F2F2" w:val="clear"/>
             <w:tcMar>
               <w:top w:type="dxa" w:w="70"/>
               <w:left w:type="dxa" w:w="110"/>
@@ -13236,7 +13727,7 @@
         <w:tc>
           <w:tcPr>
             <w:tcW w:type="dxa" w:w="3800"/>
-            <w:shd w:fill="FFFFFF" w:val="clear"/>
+            <w:shd w:fill="F2F2F2" w:val="clear"/>
             <w:tcMar>
               <w:top w:type="dxa" w:w="70"/>
               <w:left w:type="dxa" w:w="110"/>
@@ -13328,11 +13819,11 @@
         <w:keepLines/>
         <w:spacing w:after="160" w:before="380"/>
       </w:pPr>
-      <w:bookmarkStart w:name="_Toc24" w:id="24"/>
+      <w:bookmarkStart w:name="_Toc25" w:id="25"/>
       <w:r>
         <w:t xml:space="preserve">6. Site publicado</w:t>
       </w:r>
-      <w:bookmarkEnd w:id="24"/>
+      <w:bookmarkEnd w:id="25"/>
     </w:p>
     <w:p>
       <w:pPr>
@@ -14732,11 +15223,11 @@
         <w:keepLines/>
         <w:spacing w:after="160" w:before="380"/>
       </w:pPr>
-      <w:bookmarkStart w:name="_Toc25" w:id="25"/>
+      <w:bookmarkStart w:name="_Toc26" w:id="26"/>
       <w:r>
         <w:t xml:space="preserve">7. Regras de soma das contratações</w:t>
       </w:r>
-      <w:bookmarkEnd w:id="25"/>
+      <w:bookmarkEnd w:id="26"/>
     </w:p>
     <w:p>
       <w:pPr>
@@ -14898,11 +15389,11 @@
         <w:keepLines/>
         <w:spacing w:after="160" w:before="380"/>
       </w:pPr>
-      <w:bookmarkStart w:name="_Toc26" w:id="26"/>
+      <w:bookmarkStart w:name="_Toc27" w:id="27"/>
       <w:r>
         <w:t xml:space="preserve">8. Avaliação da conformidade</w:t>
       </w:r>
-      <w:bookmarkEnd w:id="26"/>
+      <w:bookmarkEnd w:id="27"/>
     </w:p>
     <w:tbl>
       <w:tblPr>
@@ -16135,11 +16626,11 @@
         <w:keepLines/>
         <w:spacing w:after="120" w:before="280"/>
       </w:pPr>
-      <w:bookmarkStart w:name="_Toc27" w:id="27"/>
+      <w:bookmarkStart w:name="_Toc28" w:id="28"/>
       <w:r>
         <w:t xml:space="preserve">8.1 Comparação com o grupo de pares (ADR-038)</w:t>
       </w:r>
-      <w:bookmarkEnd w:id="27"/>
+      <w:bookmarkEnd w:id="28"/>
     </w:p>
     <w:p>
       <w:pPr>
@@ -16172,11 +16663,11 @@
         <w:keepLines/>
         <w:spacing w:after="160" w:before="380"/>
       </w:pPr>
-      <w:bookmarkStart w:name="_Toc28" w:id="28"/>
+      <w:bookmarkStart w:name="_Toc29" w:id="29"/>
       <w:r>
         <w:t xml:space="preserve">9. Portal</w:t>
       </w:r>
-      <w:bookmarkEnd w:id="28"/>
+      <w:bookmarkEnd w:id="29"/>
     </w:p>
     <w:tbl>
       <w:tblPr>
@@ -17227,11 +17718,11 @@
         <w:keepLines/>
         <w:spacing w:after="160" w:before="380"/>
       </w:pPr>
-      <w:bookmarkStart w:name="_Toc29" w:id="29"/>
+      <w:bookmarkStart w:name="_Toc30" w:id="30"/>
       <w:r>
         <w:t xml:space="preserve">10. Operação</w:t>
       </w:r>
-      <w:bookmarkEnd w:id="29"/>
+      <w:bookmarkEnd w:id="30"/>
     </w:p>
     <w:tbl>
       <w:tblPr>
@@ -17608,11 +18099,11 @@
         <w:keepLines/>
         <w:spacing w:after="100" w:before="220"/>
       </w:pPr>
-      <w:bookmarkStart w:name="_Toc30" w:id="30"/>
+      <w:bookmarkStart w:name="_Toc31" w:id="31"/>
       <w:r>
         <w:t xml:space="preserve">Configuração, uma vez</w:t>
       </w:r>
-      <w:bookmarkEnd w:id="30"/>
+      <w:bookmarkEnd w:id="31"/>
     </w:p>
     <w:p>
       <w:pPr>
@@ -17703,11 +18194,11 @@
         <w:keepLines/>
         <w:spacing w:after="100" w:before="220"/>
       </w:pPr>
-      <w:bookmarkStart w:name="_Toc31" w:id="31"/>
+      <w:bookmarkStart w:name="_Toc32" w:id="32"/>
       <w:r>
         <w:t xml:space="preserve">Comandos locais</w:t>
       </w:r>
-      <w:bookmarkEnd w:id="31"/>
+      <w:bookmarkEnd w:id="32"/>
     </w:p>
     <w:tbl>
       <w:tblPr>
@@ -17930,11 +18421,11 @@
         <w:keepLines/>
         <w:spacing w:after="100" w:before="220"/>
       </w:pPr>
-      <w:bookmarkStart w:name="_Toc32" w:id="32"/>
+      <w:bookmarkStart w:name="_Toc33" w:id="33"/>
       <w:r>
         <w:t xml:space="preserve">Limites</w:t>
       </w:r>
-      <w:bookmarkEnd w:id="32"/>
+      <w:bookmarkEnd w:id="33"/>
     </w:p>
     <w:p>
       <w:pPr>
@@ -17982,11 +18473,11 @@
         <w:keepLines/>
         <w:spacing w:after="160" w:before="380"/>
       </w:pPr>
-      <w:bookmarkStart w:name="_Toc33" w:id="33"/>
+      <w:bookmarkStart w:name="_Toc34" w:id="34"/>
       <w:r>
         <w:t xml:space="preserve">11. Verificação</w:t>
       </w:r>
-      <w:bookmarkEnd w:id="33"/>
+      <w:bookmarkEnd w:id="34"/>
     </w:p>
     <w:tbl>
       <w:tblPr>
@@ -18287,11 +18778,11 @@
         <w:keepLines/>
         <w:spacing w:after="160" w:before="380"/>
       </w:pPr>
-      <w:bookmarkStart w:name="_Toc34" w:id="34"/>
+      <w:bookmarkStart w:name="_Toc35" w:id="35"/>
       <w:r>
         <w:t xml:space="preserve">12. Próximos passos e riscos</w:t>
       </w:r>
-      <w:bookmarkEnd w:id="34"/>
+      <w:bookmarkEnd w:id="35"/>
     </w:p>
     <w:tbl>
       <w:tblPr>

</xml_diff>